<commit_message>
Correct evidence coverage labels and omit collapsed proportion CIs
</commit_message>
<xml_diff>
--- a/analysis/output/manuscript/Table2.docx
+++ b/analysis/output/manuscript/Table2.docx
@@ -1432,7 +1432,7 @@
                 <w:szCs w:val="18"/>
                 <w:color w:val="000000"/>
               </w:rPr>
-              <w:t xml:space="preserve">427/427 (100.0%) (100.0–100.0)</w:t>
+              <w:t xml:space="preserve">427/427 (100.0%)</w:t>
             </w:r>
           </w:p>
         </w:tc>
@@ -2502,7 +2502,7 @@
                 <w:szCs w:val="18"/>
                 <w:color w:val="000000"/>
               </w:rPr>
-              <w:t xml:space="preserve">42/42 (100.0%) (100.0–100.0)</w:t>
+              <w:t xml:space="preserve">42/42 (100.0%)</w:t>
             </w:r>
           </w:p>
         </w:tc>

</xml_diff>

<commit_message>
Render round 11 publication figures, tables and QA report
</commit_message>
<xml_diff>
--- a/analysis/output/manuscript/Table2.docx
+++ b/analysis/output/manuscript/Table2.docx
@@ -424,7 +424,7 @@
                 <w:szCs w:val="18"/>
                 <w:color w:val="000000"/>
               </w:rPr>
-              <w:t xml:space="preserve">Against Published labels — D1–D5 (510 cells)</w:t>
+              <w:t xml:space="preserve">Against Published labels — D1–D5 (510 cells); Not Low N = 83; Low N = 427</w:t>
             </w:r>
           </w:p>
         </w:tc>
@@ -650,117 +650,117 @@
                 <w:szCs w:val="18"/>
                 <w:color w:val="000000"/>
               </w:rPr>
-              <w:t xml:space="preserve">386/510 (75.7%) (72.4–79.0)</w:t>
-            </w:r>
-          </w:p>
-        </w:tc>
-        <w:tc>
-          <w:tcPr>
-            <w:tcBorders>
-              <w:bottom w:val="none" w:sz="0" w:space="0" w:color="000000"/>
-              <w:top w:val="none" w:sz="0" w:space="0" w:color="000000"/>
-              <w:left w:val="none" w:sz="0" w:space="0" w:color="000000"/>
-              <w:right w:val="none" w:sz="0" w:space="0" w:color="000000"/>
-            </w:tcBorders>
-            <w:shd w:val="clear" w:color="auto" w:fill="FFFFFF"/>
-            <w:tcMar>
-              <w:top w:w="0" w:type="dxa"/>
-              <w:bottom w:w="0" w:type="dxa"/>
-              <w:left w:w="0" w:type="dxa"/>
-              <w:right w:w="0" w:type="dxa"/>
-            </w:tcMar>
-            <w:vAlign w:val="top"/>
-          </w:tcPr>
-          <w:p>
-            <w:pPr>
-              <w:pStyle w:val="Normal"/>
-              <w:jc w:val="left"/>
-              <w:pBdr>
-                <w:bottom w:val="none" w:sz="0" w:space="0" w:color="000000"/>
-                <w:top w:val="none" w:sz="0" w:space="0" w:color="000000"/>
-                <w:left w:val="none" w:sz="0" w:space="0" w:color="000000"/>
-                <w:right w:val="none" w:sz="0" w:space="0" w:color="000000"/>
-              </w:pBdr>
-              <w:spacing w:after="60" w:before="60" w:line="240"/>
-              <w:ind w:left="60" w:right="60" w:firstLine="0" w:firstLineChars="0"/>
-              <w:rPr>
-                <w:rFonts w:ascii="Arial" w:hAnsi="Arial" w:eastAsia="Arial" w:cs="Arial"/>
-                <w:i w:val="false"/>
-                <w:b w:val="false"/>
-                <w:u w:val="none"/>
-                <w:strike w:val="false"/>
-                <w:sz w:val="18"/>
-                <w:szCs w:val="18"/>
-                <w:color w:val="000000"/>
-              </w:rPr>
-            </w:pPr>
-            <w:r>
-              <w:rPr>
-                <w:rFonts w:ascii="Arial" w:hAnsi="Arial" w:eastAsia="Arial" w:cs="Arial"/>
-                <w:i w:val="false"/>
-                <w:b w:val="false"/>
-                <w:u w:val="none"/>
-                <w:strike w:val="false"/>
-                <w:sz w:val="18"/>
-                <w:szCs w:val="18"/>
-                <w:color w:val="000000"/>
-              </w:rPr>
-              <w:t xml:space="preserve">55/83 (66.3%) (57.3–74.7)</w:t>
-            </w:r>
-          </w:p>
-        </w:tc>
-        <w:tc>
-          <w:tcPr>
-            <w:tcBorders>
-              <w:bottom w:val="none" w:sz="0" w:space="0" w:color="000000"/>
-              <w:top w:val="none" w:sz="0" w:space="0" w:color="000000"/>
-              <w:left w:val="none" w:sz="0" w:space="0" w:color="000000"/>
-              <w:right w:val="none" w:sz="0" w:space="0" w:color="000000"/>
-            </w:tcBorders>
-            <w:shd w:val="clear" w:color="auto" w:fill="FFFFFF"/>
-            <w:tcMar>
-              <w:top w:w="0" w:type="dxa"/>
-              <w:bottom w:w="0" w:type="dxa"/>
-              <w:left w:w="0" w:type="dxa"/>
-              <w:right w:w="0" w:type="dxa"/>
-            </w:tcMar>
-            <w:vAlign w:val="top"/>
-          </w:tcPr>
-          <w:p>
-            <w:pPr>
-              <w:pStyle w:val="Normal"/>
-              <w:jc w:val="left"/>
-              <w:pBdr>
-                <w:bottom w:val="none" w:sz="0" w:space="0" w:color="000000"/>
-                <w:top w:val="none" w:sz="0" w:space="0" w:color="000000"/>
-                <w:left w:val="none" w:sz="0" w:space="0" w:color="000000"/>
-                <w:right w:val="none" w:sz="0" w:space="0" w:color="000000"/>
-              </w:pBdr>
-              <w:spacing w:after="60" w:before="60" w:line="240"/>
-              <w:ind w:left="60" w:right="60" w:firstLine="0" w:firstLineChars="0"/>
-              <w:rPr>
-                <w:rFonts w:ascii="Arial" w:hAnsi="Arial" w:eastAsia="Arial" w:cs="Arial"/>
-                <w:i w:val="false"/>
-                <w:b w:val="false"/>
-                <w:u w:val="none"/>
-                <w:strike w:val="false"/>
-                <w:sz w:val="18"/>
-                <w:szCs w:val="18"/>
-                <w:color w:val="000000"/>
-              </w:rPr>
-            </w:pPr>
-            <w:r>
-              <w:rPr>
-                <w:rFonts w:ascii="Arial" w:hAnsi="Arial" w:eastAsia="Arial" w:cs="Arial"/>
-                <w:i w:val="false"/>
-                <w:b w:val="false"/>
-                <w:u w:val="none"/>
-                <w:strike w:val="false"/>
-                <w:sz w:val="18"/>
-                <w:szCs w:val="18"/>
-                <w:color w:val="000000"/>
-              </w:rPr>
-              <w:t xml:space="preserve">347/427 (81.3%) (77.7–84.7)</w:t>
+              <w:t xml:space="preserve">75.7 (72.4–79.0)</w:t>
+            </w:r>
+          </w:p>
+        </w:tc>
+        <w:tc>
+          <w:tcPr>
+            <w:tcBorders>
+              <w:bottom w:val="none" w:sz="0" w:space="0" w:color="000000"/>
+              <w:top w:val="none" w:sz="0" w:space="0" w:color="000000"/>
+              <w:left w:val="none" w:sz="0" w:space="0" w:color="000000"/>
+              <w:right w:val="none" w:sz="0" w:space="0" w:color="000000"/>
+            </w:tcBorders>
+            <w:shd w:val="clear" w:color="auto" w:fill="FFFFFF"/>
+            <w:tcMar>
+              <w:top w:w="0" w:type="dxa"/>
+              <w:bottom w:w="0" w:type="dxa"/>
+              <w:left w:w="0" w:type="dxa"/>
+              <w:right w:w="0" w:type="dxa"/>
+            </w:tcMar>
+            <w:vAlign w:val="top"/>
+          </w:tcPr>
+          <w:p>
+            <w:pPr>
+              <w:pStyle w:val="Normal"/>
+              <w:jc w:val="left"/>
+              <w:pBdr>
+                <w:bottom w:val="none" w:sz="0" w:space="0" w:color="000000"/>
+                <w:top w:val="none" w:sz="0" w:space="0" w:color="000000"/>
+                <w:left w:val="none" w:sz="0" w:space="0" w:color="000000"/>
+                <w:right w:val="none" w:sz="0" w:space="0" w:color="000000"/>
+              </w:pBdr>
+              <w:spacing w:after="60" w:before="60" w:line="240"/>
+              <w:ind w:left="60" w:right="60" w:firstLine="0" w:firstLineChars="0"/>
+              <w:rPr>
+                <w:rFonts w:ascii="Arial" w:hAnsi="Arial" w:eastAsia="Arial" w:cs="Arial"/>
+                <w:i w:val="false"/>
+                <w:b w:val="false"/>
+                <w:u w:val="none"/>
+                <w:strike w:val="false"/>
+                <w:sz w:val="18"/>
+                <w:szCs w:val="18"/>
+                <w:color w:val="000000"/>
+              </w:rPr>
+            </w:pPr>
+            <w:r>
+              <w:rPr>
+                <w:rFonts w:ascii="Arial" w:hAnsi="Arial" w:eastAsia="Arial" w:cs="Arial"/>
+                <w:i w:val="false"/>
+                <w:b w:val="false"/>
+                <w:u w:val="none"/>
+                <w:strike w:val="false"/>
+                <w:sz w:val="18"/>
+                <w:szCs w:val="18"/>
+                <w:color w:val="000000"/>
+              </w:rPr>
+              <w:t xml:space="preserve">66.3 (57.3–74.7)</w:t>
+            </w:r>
+          </w:p>
+        </w:tc>
+        <w:tc>
+          <w:tcPr>
+            <w:tcBorders>
+              <w:bottom w:val="none" w:sz="0" w:space="0" w:color="000000"/>
+              <w:top w:val="none" w:sz="0" w:space="0" w:color="000000"/>
+              <w:left w:val="none" w:sz="0" w:space="0" w:color="000000"/>
+              <w:right w:val="none" w:sz="0" w:space="0" w:color="000000"/>
+            </w:tcBorders>
+            <w:shd w:val="clear" w:color="auto" w:fill="FFFFFF"/>
+            <w:tcMar>
+              <w:top w:w="0" w:type="dxa"/>
+              <w:bottom w:w="0" w:type="dxa"/>
+              <w:left w:w="0" w:type="dxa"/>
+              <w:right w:w="0" w:type="dxa"/>
+            </w:tcMar>
+            <w:vAlign w:val="top"/>
+          </w:tcPr>
+          <w:p>
+            <w:pPr>
+              <w:pStyle w:val="Normal"/>
+              <w:jc w:val="left"/>
+              <w:pBdr>
+                <w:bottom w:val="none" w:sz="0" w:space="0" w:color="000000"/>
+                <w:top w:val="none" w:sz="0" w:space="0" w:color="000000"/>
+                <w:left w:val="none" w:sz="0" w:space="0" w:color="000000"/>
+                <w:right w:val="none" w:sz="0" w:space="0" w:color="000000"/>
+              </w:pBdr>
+              <w:spacing w:after="60" w:before="60" w:line="240"/>
+              <w:ind w:left="60" w:right="60" w:firstLine="0" w:firstLineChars="0"/>
+              <w:rPr>
+                <w:rFonts w:ascii="Arial" w:hAnsi="Arial" w:eastAsia="Arial" w:cs="Arial"/>
+                <w:i w:val="false"/>
+                <w:b w:val="false"/>
+                <w:u w:val="none"/>
+                <w:strike w:val="false"/>
+                <w:sz w:val="18"/>
+                <w:szCs w:val="18"/>
+                <w:color w:val="000000"/>
+              </w:rPr>
+            </w:pPr>
+            <w:r>
+              <w:rPr>
+                <w:rFonts w:ascii="Arial" w:hAnsi="Arial" w:eastAsia="Arial" w:cs="Arial"/>
+                <w:i w:val="false"/>
+                <w:b w:val="false"/>
+                <w:u w:val="none"/>
+                <w:strike w:val="false"/>
+                <w:sz w:val="18"/>
+                <w:szCs w:val="18"/>
+                <w:color w:val="000000"/>
+              </w:rPr>
+              <w:t xml:space="preserve">81.3 (77.7–84.7)</w:t>
             </w:r>
           </w:p>
         </w:tc>
@@ -986,117 +986,117 @@
                 <w:szCs w:val="18"/>
                 <w:color w:val="000000"/>
               </w:rPr>
-              <w:t xml:space="preserve">395/510 (77.5%) (74.1–80.8)</w:t>
-            </w:r>
-          </w:p>
-        </w:tc>
-        <w:tc>
-          <w:tcPr>
-            <w:tcBorders>
-              <w:bottom w:val="none" w:sz="0" w:space="0" w:color="000000"/>
-              <w:top w:val="none" w:sz="0" w:space="0" w:color="000000"/>
-              <w:left w:val="none" w:sz="0" w:space="0" w:color="000000"/>
-              <w:right w:val="none" w:sz="0" w:space="0" w:color="000000"/>
-            </w:tcBorders>
-            <w:shd w:val="clear" w:color="auto" w:fill="FFFFFF"/>
-            <w:tcMar>
-              <w:top w:w="0" w:type="dxa"/>
-              <w:bottom w:w="0" w:type="dxa"/>
-              <w:left w:w="0" w:type="dxa"/>
-              <w:right w:w="0" w:type="dxa"/>
-            </w:tcMar>
-            <w:vAlign w:val="top"/>
-          </w:tcPr>
-          <w:p>
-            <w:pPr>
-              <w:pStyle w:val="Normal"/>
-              <w:jc w:val="left"/>
-              <w:pBdr>
-                <w:bottom w:val="none" w:sz="0" w:space="0" w:color="000000"/>
-                <w:top w:val="none" w:sz="0" w:space="0" w:color="000000"/>
-                <w:left w:val="none" w:sz="0" w:space="0" w:color="000000"/>
-                <w:right w:val="none" w:sz="0" w:space="0" w:color="000000"/>
-              </w:pBdr>
-              <w:spacing w:after="60" w:before="60" w:line="240"/>
-              <w:ind w:left="60" w:right="60" w:firstLine="0" w:firstLineChars="0"/>
-              <w:rPr>
-                <w:rFonts w:ascii="Arial" w:hAnsi="Arial" w:eastAsia="Arial" w:cs="Arial"/>
-                <w:i w:val="false"/>
-                <w:b w:val="false"/>
-                <w:u w:val="none"/>
-                <w:strike w:val="false"/>
-                <w:sz w:val="18"/>
-                <w:szCs w:val="18"/>
-                <w:color w:val="000000"/>
-              </w:rPr>
-            </w:pPr>
-            <w:r>
-              <w:rPr>
-                <w:rFonts w:ascii="Arial" w:hAnsi="Arial" w:eastAsia="Arial" w:cs="Arial"/>
-                <w:i w:val="false"/>
-                <w:b w:val="false"/>
-                <w:u w:val="none"/>
-                <w:strike w:val="false"/>
-                <w:sz w:val="18"/>
-                <w:szCs w:val="18"/>
-                <w:color w:val="000000"/>
-              </w:rPr>
-              <w:t xml:space="preserve">42/83 (50.6%) (40.3–60.2)</w:t>
-            </w:r>
-          </w:p>
-        </w:tc>
-        <w:tc>
-          <w:tcPr>
-            <w:tcBorders>
-              <w:bottom w:val="none" w:sz="0" w:space="0" w:color="000000"/>
-              <w:top w:val="none" w:sz="0" w:space="0" w:color="000000"/>
-              <w:left w:val="none" w:sz="0" w:space="0" w:color="000000"/>
-              <w:right w:val="none" w:sz="0" w:space="0" w:color="000000"/>
-            </w:tcBorders>
-            <w:shd w:val="clear" w:color="auto" w:fill="FFFFFF"/>
-            <w:tcMar>
-              <w:top w:w="0" w:type="dxa"/>
-              <w:bottom w:w="0" w:type="dxa"/>
-              <w:left w:w="0" w:type="dxa"/>
-              <w:right w:w="0" w:type="dxa"/>
-            </w:tcMar>
-            <w:vAlign w:val="top"/>
-          </w:tcPr>
-          <w:p>
-            <w:pPr>
-              <w:pStyle w:val="Normal"/>
-              <w:jc w:val="left"/>
-              <w:pBdr>
-                <w:bottom w:val="none" w:sz="0" w:space="0" w:color="000000"/>
-                <w:top w:val="none" w:sz="0" w:space="0" w:color="000000"/>
-                <w:left w:val="none" w:sz="0" w:space="0" w:color="000000"/>
-                <w:right w:val="none" w:sz="0" w:space="0" w:color="000000"/>
-              </w:pBdr>
-              <w:spacing w:after="60" w:before="60" w:line="240"/>
-              <w:ind w:left="60" w:right="60" w:firstLine="0" w:firstLineChars="0"/>
-              <w:rPr>
-                <w:rFonts w:ascii="Arial" w:hAnsi="Arial" w:eastAsia="Arial" w:cs="Arial"/>
-                <w:i w:val="false"/>
-                <w:b w:val="false"/>
-                <w:u w:val="none"/>
-                <w:strike w:val="false"/>
-                <w:sz w:val="18"/>
-                <w:szCs w:val="18"/>
-                <w:color w:val="000000"/>
-              </w:rPr>
-            </w:pPr>
-            <w:r>
-              <w:rPr>
-                <w:rFonts w:ascii="Arial" w:hAnsi="Arial" w:eastAsia="Arial" w:cs="Arial"/>
-                <w:i w:val="false"/>
-                <w:b w:val="false"/>
-                <w:u w:val="none"/>
-                <w:strike w:val="false"/>
-                <w:sz w:val="18"/>
-                <w:szCs w:val="18"/>
-                <w:color w:val="000000"/>
-              </w:rPr>
-              <w:t xml:space="preserve">366/427 (85.7%) (82.1–89.3)</w:t>
+              <w:t xml:space="preserve">77.5 (74.1–80.8)</w:t>
+            </w:r>
+          </w:p>
+        </w:tc>
+        <w:tc>
+          <w:tcPr>
+            <w:tcBorders>
+              <w:bottom w:val="none" w:sz="0" w:space="0" w:color="000000"/>
+              <w:top w:val="none" w:sz="0" w:space="0" w:color="000000"/>
+              <w:left w:val="none" w:sz="0" w:space="0" w:color="000000"/>
+              <w:right w:val="none" w:sz="0" w:space="0" w:color="000000"/>
+            </w:tcBorders>
+            <w:shd w:val="clear" w:color="auto" w:fill="FFFFFF"/>
+            <w:tcMar>
+              <w:top w:w="0" w:type="dxa"/>
+              <w:bottom w:w="0" w:type="dxa"/>
+              <w:left w:w="0" w:type="dxa"/>
+              <w:right w:w="0" w:type="dxa"/>
+            </w:tcMar>
+            <w:vAlign w:val="top"/>
+          </w:tcPr>
+          <w:p>
+            <w:pPr>
+              <w:pStyle w:val="Normal"/>
+              <w:jc w:val="left"/>
+              <w:pBdr>
+                <w:bottom w:val="none" w:sz="0" w:space="0" w:color="000000"/>
+                <w:top w:val="none" w:sz="0" w:space="0" w:color="000000"/>
+                <w:left w:val="none" w:sz="0" w:space="0" w:color="000000"/>
+                <w:right w:val="none" w:sz="0" w:space="0" w:color="000000"/>
+              </w:pBdr>
+              <w:spacing w:after="60" w:before="60" w:line="240"/>
+              <w:ind w:left="60" w:right="60" w:firstLine="0" w:firstLineChars="0"/>
+              <w:rPr>
+                <w:rFonts w:ascii="Arial" w:hAnsi="Arial" w:eastAsia="Arial" w:cs="Arial"/>
+                <w:i w:val="false"/>
+                <w:b w:val="false"/>
+                <w:u w:val="none"/>
+                <w:strike w:val="false"/>
+                <w:sz w:val="18"/>
+                <w:szCs w:val="18"/>
+                <w:color w:val="000000"/>
+              </w:rPr>
+            </w:pPr>
+            <w:r>
+              <w:rPr>
+                <w:rFonts w:ascii="Arial" w:hAnsi="Arial" w:eastAsia="Arial" w:cs="Arial"/>
+                <w:i w:val="false"/>
+                <w:b w:val="false"/>
+                <w:u w:val="none"/>
+                <w:strike w:val="false"/>
+                <w:sz w:val="18"/>
+                <w:szCs w:val="18"/>
+                <w:color w:val="000000"/>
+              </w:rPr>
+              <w:t xml:space="preserve">50.6 (40.3–60.2)</w:t>
+            </w:r>
+          </w:p>
+        </w:tc>
+        <w:tc>
+          <w:tcPr>
+            <w:tcBorders>
+              <w:bottom w:val="none" w:sz="0" w:space="0" w:color="000000"/>
+              <w:top w:val="none" w:sz="0" w:space="0" w:color="000000"/>
+              <w:left w:val="none" w:sz="0" w:space="0" w:color="000000"/>
+              <w:right w:val="none" w:sz="0" w:space="0" w:color="000000"/>
+            </w:tcBorders>
+            <w:shd w:val="clear" w:color="auto" w:fill="FFFFFF"/>
+            <w:tcMar>
+              <w:top w:w="0" w:type="dxa"/>
+              <w:bottom w:w="0" w:type="dxa"/>
+              <w:left w:w="0" w:type="dxa"/>
+              <w:right w:w="0" w:type="dxa"/>
+            </w:tcMar>
+            <w:vAlign w:val="top"/>
+          </w:tcPr>
+          <w:p>
+            <w:pPr>
+              <w:pStyle w:val="Normal"/>
+              <w:jc w:val="left"/>
+              <w:pBdr>
+                <w:bottom w:val="none" w:sz="0" w:space="0" w:color="000000"/>
+                <w:top w:val="none" w:sz="0" w:space="0" w:color="000000"/>
+                <w:left w:val="none" w:sz="0" w:space="0" w:color="000000"/>
+                <w:right w:val="none" w:sz="0" w:space="0" w:color="000000"/>
+              </w:pBdr>
+              <w:spacing w:after="60" w:before="60" w:line="240"/>
+              <w:ind w:left="60" w:right="60" w:firstLine="0" w:firstLineChars="0"/>
+              <w:rPr>
+                <w:rFonts w:ascii="Arial" w:hAnsi="Arial" w:eastAsia="Arial" w:cs="Arial"/>
+                <w:i w:val="false"/>
+                <w:b w:val="false"/>
+                <w:u w:val="none"/>
+                <w:strike w:val="false"/>
+                <w:sz w:val="18"/>
+                <w:szCs w:val="18"/>
+                <w:color w:val="000000"/>
+              </w:rPr>
+            </w:pPr>
+            <w:r>
+              <w:rPr>
+                <w:rFonts w:ascii="Arial" w:hAnsi="Arial" w:eastAsia="Arial" w:cs="Arial"/>
+                <w:i w:val="false"/>
+                <w:b w:val="false"/>
+                <w:u w:val="none"/>
+                <w:strike w:val="false"/>
+                <w:sz w:val="18"/>
+                <w:szCs w:val="18"/>
+                <w:color w:val="000000"/>
+              </w:rPr>
+              <w:t xml:space="preserve">85.7 (82.1–89.3)</w:t>
             </w:r>
           </w:p>
         </w:tc>
@@ -1322,7 +1322,7 @@
                 <w:szCs w:val="18"/>
                 <w:color w:val="000000"/>
               </w:rPr>
-              <w:t xml:space="preserve">427/510 (83.7%) (81.0–86.5)</w:t>
+              <w:t xml:space="preserve">83.7 (81.0–86.5)</w:t>
             </w:r>
           </w:p>
         </w:tc>
@@ -1432,7 +1432,7 @@
                 <w:szCs w:val="18"/>
                 <w:color w:val="000000"/>
               </w:rPr>
-              <w:t xml:space="preserve">427/427 (100.0%)</w:t>
+              <w:t xml:space="preserve">100.0</w:t>
             </w:r>
           </w:p>
         </w:tc>
@@ -1494,7 +1494,7 @@
                 <w:szCs w:val="18"/>
                 <w:color w:val="000000"/>
               </w:rPr>
-              <w:t xml:space="preserve">Against Published labels — Overall (81 trials)</w:t>
+              <w:t xml:space="preserve">Against Published labels — Overall (81 trials); Not Low N = 39; Low N = 42</w:t>
             </w:r>
           </w:p>
         </w:tc>
@@ -1720,117 +1720,117 @@
                 <w:szCs w:val="18"/>
                 <w:color w:val="000000"/>
               </w:rPr>
-              <w:t xml:space="preserve">47/81 (58.0%) (49.4–66.7)</w:t>
-            </w:r>
-          </w:p>
-        </w:tc>
-        <w:tc>
-          <w:tcPr>
-            <w:tcBorders>
-              <w:bottom w:val="none" w:sz="0" w:space="0" w:color="000000"/>
-              <w:top w:val="none" w:sz="0" w:space="0" w:color="000000"/>
-              <w:left w:val="none" w:sz="0" w:space="0" w:color="000000"/>
-              <w:right w:val="none" w:sz="0" w:space="0" w:color="000000"/>
-            </w:tcBorders>
-            <w:shd w:val="clear" w:color="auto" w:fill="FFFFFF"/>
-            <w:tcMar>
-              <w:top w:w="0" w:type="dxa"/>
-              <w:bottom w:w="0" w:type="dxa"/>
-              <w:left w:w="0" w:type="dxa"/>
-              <w:right w:w="0" w:type="dxa"/>
-            </w:tcMar>
-            <w:vAlign w:val="top"/>
-          </w:tcPr>
-          <w:p>
-            <w:pPr>
-              <w:pStyle w:val="Normal"/>
-              <w:jc w:val="left"/>
-              <w:pBdr>
-                <w:bottom w:val="none" w:sz="0" w:space="0" w:color="000000"/>
-                <w:top w:val="none" w:sz="0" w:space="0" w:color="000000"/>
-                <w:left w:val="none" w:sz="0" w:space="0" w:color="000000"/>
-                <w:right w:val="none" w:sz="0" w:space="0" w:color="000000"/>
-              </w:pBdr>
-              <w:spacing w:after="60" w:before="60" w:line="240"/>
-              <w:ind w:left="60" w:right="60" w:firstLine="0" w:firstLineChars="0"/>
-              <w:rPr>
-                <w:rFonts w:ascii="Arial" w:hAnsi="Arial" w:eastAsia="Arial" w:cs="Arial"/>
-                <w:i w:val="false"/>
-                <w:b w:val="false"/>
-                <w:u w:val="none"/>
-                <w:strike w:val="false"/>
-                <w:sz w:val="18"/>
-                <w:szCs w:val="18"/>
-                <w:color w:val="000000"/>
-              </w:rPr>
-            </w:pPr>
-            <w:r>
-              <w:rPr>
-                <w:rFonts w:ascii="Arial" w:hAnsi="Arial" w:eastAsia="Arial" w:cs="Arial"/>
-                <w:i w:val="false"/>
-                <w:b w:val="false"/>
-                <w:u w:val="none"/>
-                <w:strike w:val="false"/>
-                <w:sz w:val="18"/>
-                <w:szCs w:val="18"/>
-                <w:color w:val="000000"/>
-              </w:rPr>
-              <w:t xml:space="preserve">36/39 (92.3%) (83.7–100.0)</w:t>
-            </w:r>
-          </w:p>
-        </w:tc>
-        <w:tc>
-          <w:tcPr>
-            <w:tcBorders>
-              <w:bottom w:val="none" w:sz="0" w:space="0" w:color="000000"/>
-              <w:top w:val="none" w:sz="0" w:space="0" w:color="000000"/>
-              <w:left w:val="none" w:sz="0" w:space="0" w:color="000000"/>
-              <w:right w:val="none" w:sz="0" w:space="0" w:color="000000"/>
-            </w:tcBorders>
-            <w:shd w:val="clear" w:color="auto" w:fill="FFFFFF"/>
-            <w:tcMar>
-              <w:top w:w="0" w:type="dxa"/>
-              <w:bottom w:w="0" w:type="dxa"/>
-              <w:left w:w="0" w:type="dxa"/>
-              <w:right w:w="0" w:type="dxa"/>
-            </w:tcMar>
-            <w:vAlign w:val="top"/>
-          </w:tcPr>
-          <w:p>
-            <w:pPr>
-              <w:pStyle w:val="Normal"/>
-              <w:jc w:val="left"/>
-              <w:pBdr>
-                <w:bottom w:val="none" w:sz="0" w:space="0" w:color="000000"/>
-                <w:top w:val="none" w:sz="0" w:space="0" w:color="000000"/>
-                <w:left w:val="none" w:sz="0" w:space="0" w:color="000000"/>
-                <w:right w:val="none" w:sz="0" w:space="0" w:color="000000"/>
-              </w:pBdr>
-              <w:spacing w:after="60" w:before="60" w:line="240"/>
-              <w:ind w:left="60" w:right="60" w:firstLine="0" w:firstLineChars="0"/>
-              <w:rPr>
-                <w:rFonts w:ascii="Arial" w:hAnsi="Arial" w:eastAsia="Arial" w:cs="Arial"/>
-                <w:i w:val="false"/>
-                <w:b w:val="false"/>
-                <w:u w:val="none"/>
-                <w:strike w:val="false"/>
-                <w:sz w:val="18"/>
-                <w:szCs w:val="18"/>
-                <w:color w:val="000000"/>
-              </w:rPr>
-            </w:pPr>
-            <w:r>
-              <w:rPr>
-                <w:rFonts w:ascii="Arial" w:hAnsi="Arial" w:eastAsia="Arial" w:cs="Arial"/>
-                <w:i w:val="false"/>
-                <w:b w:val="false"/>
-                <w:u w:val="none"/>
-                <w:strike w:val="false"/>
-                <w:sz w:val="18"/>
-                <w:szCs w:val="18"/>
-                <w:color w:val="000000"/>
-              </w:rPr>
-              <w:t xml:space="preserve">23/42 (54.8%) (44.2–67.4)</w:t>
+              <w:t xml:space="preserve">58.0 (49.4–66.7)</w:t>
+            </w:r>
+          </w:p>
+        </w:tc>
+        <w:tc>
+          <w:tcPr>
+            <w:tcBorders>
+              <w:bottom w:val="none" w:sz="0" w:space="0" w:color="000000"/>
+              <w:top w:val="none" w:sz="0" w:space="0" w:color="000000"/>
+              <w:left w:val="none" w:sz="0" w:space="0" w:color="000000"/>
+              <w:right w:val="none" w:sz="0" w:space="0" w:color="000000"/>
+            </w:tcBorders>
+            <w:shd w:val="clear" w:color="auto" w:fill="FFFFFF"/>
+            <w:tcMar>
+              <w:top w:w="0" w:type="dxa"/>
+              <w:bottom w:w="0" w:type="dxa"/>
+              <w:left w:w="0" w:type="dxa"/>
+              <w:right w:w="0" w:type="dxa"/>
+            </w:tcMar>
+            <w:vAlign w:val="top"/>
+          </w:tcPr>
+          <w:p>
+            <w:pPr>
+              <w:pStyle w:val="Normal"/>
+              <w:jc w:val="left"/>
+              <w:pBdr>
+                <w:bottom w:val="none" w:sz="0" w:space="0" w:color="000000"/>
+                <w:top w:val="none" w:sz="0" w:space="0" w:color="000000"/>
+                <w:left w:val="none" w:sz="0" w:space="0" w:color="000000"/>
+                <w:right w:val="none" w:sz="0" w:space="0" w:color="000000"/>
+              </w:pBdr>
+              <w:spacing w:after="60" w:before="60" w:line="240"/>
+              <w:ind w:left="60" w:right="60" w:firstLine="0" w:firstLineChars="0"/>
+              <w:rPr>
+                <w:rFonts w:ascii="Arial" w:hAnsi="Arial" w:eastAsia="Arial" w:cs="Arial"/>
+                <w:i w:val="false"/>
+                <w:b w:val="false"/>
+                <w:u w:val="none"/>
+                <w:strike w:val="false"/>
+                <w:sz w:val="18"/>
+                <w:szCs w:val="18"/>
+                <w:color w:val="000000"/>
+              </w:rPr>
+            </w:pPr>
+            <w:r>
+              <w:rPr>
+                <w:rFonts w:ascii="Arial" w:hAnsi="Arial" w:eastAsia="Arial" w:cs="Arial"/>
+                <w:i w:val="false"/>
+                <w:b w:val="false"/>
+                <w:u w:val="none"/>
+                <w:strike w:val="false"/>
+                <w:sz w:val="18"/>
+                <w:szCs w:val="18"/>
+                <w:color w:val="000000"/>
+              </w:rPr>
+              <w:t xml:space="preserve">92.3 (83.7–100.0)</w:t>
+            </w:r>
+          </w:p>
+        </w:tc>
+        <w:tc>
+          <w:tcPr>
+            <w:tcBorders>
+              <w:bottom w:val="none" w:sz="0" w:space="0" w:color="000000"/>
+              <w:top w:val="none" w:sz="0" w:space="0" w:color="000000"/>
+              <w:left w:val="none" w:sz="0" w:space="0" w:color="000000"/>
+              <w:right w:val="none" w:sz="0" w:space="0" w:color="000000"/>
+            </w:tcBorders>
+            <w:shd w:val="clear" w:color="auto" w:fill="FFFFFF"/>
+            <w:tcMar>
+              <w:top w:w="0" w:type="dxa"/>
+              <w:bottom w:w="0" w:type="dxa"/>
+              <w:left w:w="0" w:type="dxa"/>
+              <w:right w:w="0" w:type="dxa"/>
+            </w:tcMar>
+            <w:vAlign w:val="top"/>
+          </w:tcPr>
+          <w:p>
+            <w:pPr>
+              <w:pStyle w:val="Normal"/>
+              <w:jc w:val="left"/>
+              <w:pBdr>
+                <w:bottom w:val="none" w:sz="0" w:space="0" w:color="000000"/>
+                <w:top w:val="none" w:sz="0" w:space="0" w:color="000000"/>
+                <w:left w:val="none" w:sz="0" w:space="0" w:color="000000"/>
+                <w:right w:val="none" w:sz="0" w:space="0" w:color="000000"/>
+              </w:pBdr>
+              <w:spacing w:after="60" w:before="60" w:line="240"/>
+              <w:ind w:left="60" w:right="60" w:firstLine="0" w:firstLineChars="0"/>
+              <w:rPr>
+                <w:rFonts w:ascii="Arial" w:hAnsi="Arial" w:eastAsia="Arial" w:cs="Arial"/>
+                <w:i w:val="false"/>
+                <w:b w:val="false"/>
+                <w:u w:val="none"/>
+                <w:strike w:val="false"/>
+                <w:sz w:val="18"/>
+                <w:szCs w:val="18"/>
+                <w:color w:val="000000"/>
+              </w:rPr>
+            </w:pPr>
+            <w:r>
+              <w:rPr>
+                <w:rFonts w:ascii="Arial" w:hAnsi="Arial" w:eastAsia="Arial" w:cs="Arial"/>
+                <w:i w:val="false"/>
+                <w:b w:val="false"/>
+                <w:u w:val="none"/>
+                <w:strike w:val="false"/>
+                <w:sz w:val="18"/>
+                <w:szCs w:val="18"/>
+                <w:color w:val="000000"/>
+              </w:rPr>
+              <w:t xml:space="preserve">54.8 (44.2–67.4)</w:t>
             </w:r>
           </w:p>
         </w:tc>
@@ -2056,117 +2056,117 @@
                 <w:szCs w:val="18"/>
                 <w:color w:val="000000"/>
               </w:rPr>
-              <w:t xml:space="preserve">48/81 (59.3%) (50.6–67.9)</w:t>
-            </w:r>
-          </w:p>
-        </w:tc>
-        <w:tc>
-          <w:tcPr>
-            <w:tcBorders>
-              <w:bottom w:val="none" w:sz="0" w:space="0" w:color="000000"/>
-              <w:top w:val="none" w:sz="0" w:space="0" w:color="000000"/>
-              <w:left w:val="none" w:sz="0" w:space="0" w:color="000000"/>
-              <w:right w:val="none" w:sz="0" w:space="0" w:color="000000"/>
-            </w:tcBorders>
-            <w:shd w:val="clear" w:color="auto" w:fill="FFFFFF"/>
-            <w:tcMar>
-              <w:top w:w="0" w:type="dxa"/>
-              <w:bottom w:w="0" w:type="dxa"/>
-              <w:left w:w="0" w:type="dxa"/>
-              <w:right w:w="0" w:type="dxa"/>
-            </w:tcMar>
-            <w:vAlign w:val="top"/>
-          </w:tcPr>
-          <w:p>
-            <w:pPr>
-              <w:pStyle w:val="Normal"/>
-              <w:jc w:val="left"/>
-              <w:pBdr>
-                <w:bottom w:val="none" w:sz="0" w:space="0" w:color="000000"/>
-                <w:top w:val="none" w:sz="0" w:space="0" w:color="000000"/>
-                <w:left w:val="none" w:sz="0" w:space="0" w:color="000000"/>
-                <w:right w:val="none" w:sz="0" w:space="0" w:color="000000"/>
-              </w:pBdr>
-              <w:spacing w:after="60" w:before="60" w:line="240"/>
-              <w:ind w:left="60" w:right="60" w:firstLine="0" w:firstLineChars="0"/>
-              <w:rPr>
-                <w:rFonts w:ascii="Arial" w:hAnsi="Arial" w:eastAsia="Arial" w:cs="Arial"/>
-                <w:i w:val="false"/>
-                <w:b w:val="false"/>
-                <w:u w:val="none"/>
-                <w:strike w:val="false"/>
-                <w:sz w:val="18"/>
-                <w:szCs w:val="18"/>
-                <w:color w:val="000000"/>
-              </w:rPr>
-            </w:pPr>
-            <w:r>
-              <w:rPr>
-                <w:rFonts w:ascii="Arial" w:hAnsi="Arial" w:eastAsia="Arial" w:cs="Arial"/>
-                <w:i w:val="false"/>
-                <w:b w:val="false"/>
-                <w:u w:val="none"/>
-                <w:strike w:val="false"/>
-                <w:sz w:val="18"/>
-                <w:szCs w:val="18"/>
-                <w:color w:val="000000"/>
-              </w:rPr>
-              <w:t xml:space="preserve">25/39 (64.1%) (50.0–77.8)</w:t>
-            </w:r>
-          </w:p>
-        </w:tc>
-        <w:tc>
-          <w:tcPr>
-            <w:tcBorders>
-              <w:bottom w:val="none" w:sz="0" w:space="0" w:color="000000"/>
-              <w:top w:val="none" w:sz="0" w:space="0" w:color="000000"/>
-              <w:left w:val="none" w:sz="0" w:space="0" w:color="000000"/>
-              <w:right w:val="none" w:sz="0" w:space="0" w:color="000000"/>
-            </w:tcBorders>
-            <w:shd w:val="clear" w:color="auto" w:fill="FFFFFF"/>
-            <w:tcMar>
-              <w:top w:w="0" w:type="dxa"/>
-              <w:bottom w:w="0" w:type="dxa"/>
-              <w:left w:w="0" w:type="dxa"/>
-              <w:right w:w="0" w:type="dxa"/>
-            </w:tcMar>
-            <w:vAlign w:val="top"/>
-          </w:tcPr>
-          <w:p>
-            <w:pPr>
-              <w:pStyle w:val="Normal"/>
-              <w:jc w:val="left"/>
-              <w:pBdr>
-                <w:bottom w:val="none" w:sz="0" w:space="0" w:color="000000"/>
-                <w:top w:val="none" w:sz="0" w:space="0" w:color="000000"/>
-                <w:left w:val="none" w:sz="0" w:space="0" w:color="000000"/>
-                <w:right w:val="none" w:sz="0" w:space="0" w:color="000000"/>
-              </w:pBdr>
-              <w:spacing w:after="60" w:before="60" w:line="240"/>
-              <w:ind w:left="60" w:right="60" w:firstLine="0" w:firstLineChars="0"/>
-              <w:rPr>
-                <w:rFonts w:ascii="Arial" w:hAnsi="Arial" w:eastAsia="Arial" w:cs="Arial"/>
-                <w:i w:val="false"/>
-                <w:b w:val="false"/>
-                <w:u w:val="none"/>
-                <w:strike w:val="false"/>
-                <w:sz w:val="18"/>
-                <w:szCs w:val="18"/>
-                <w:color w:val="000000"/>
-              </w:rPr>
-            </w:pPr>
-            <w:r>
-              <w:rPr>
-                <w:rFonts w:ascii="Arial" w:hAnsi="Arial" w:eastAsia="Arial" w:cs="Arial"/>
-                <w:i w:val="false"/>
-                <w:b w:val="false"/>
-                <w:u w:val="none"/>
-                <w:strike w:val="false"/>
-                <w:sz w:val="18"/>
-                <w:szCs w:val="18"/>
-                <w:color w:val="000000"/>
-              </w:rPr>
-              <w:t xml:space="preserve">32/42 (76.2%) (65.9–86.8)</w:t>
+              <w:t xml:space="preserve">59.3 (50.6–67.9)</w:t>
+            </w:r>
+          </w:p>
+        </w:tc>
+        <w:tc>
+          <w:tcPr>
+            <w:tcBorders>
+              <w:bottom w:val="none" w:sz="0" w:space="0" w:color="000000"/>
+              <w:top w:val="none" w:sz="0" w:space="0" w:color="000000"/>
+              <w:left w:val="none" w:sz="0" w:space="0" w:color="000000"/>
+              <w:right w:val="none" w:sz="0" w:space="0" w:color="000000"/>
+            </w:tcBorders>
+            <w:shd w:val="clear" w:color="auto" w:fill="FFFFFF"/>
+            <w:tcMar>
+              <w:top w:w="0" w:type="dxa"/>
+              <w:bottom w:w="0" w:type="dxa"/>
+              <w:left w:w="0" w:type="dxa"/>
+              <w:right w:w="0" w:type="dxa"/>
+            </w:tcMar>
+            <w:vAlign w:val="top"/>
+          </w:tcPr>
+          <w:p>
+            <w:pPr>
+              <w:pStyle w:val="Normal"/>
+              <w:jc w:val="left"/>
+              <w:pBdr>
+                <w:bottom w:val="none" w:sz="0" w:space="0" w:color="000000"/>
+                <w:top w:val="none" w:sz="0" w:space="0" w:color="000000"/>
+                <w:left w:val="none" w:sz="0" w:space="0" w:color="000000"/>
+                <w:right w:val="none" w:sz="0" w:space="0" w:color="000000"/>
+              </w:pBdr>
+              <w:spacing w:after="60" w:before="60" w:line="240"/>
+              <w:ind w:left="60" w:right="60" w:firstLine="0" w:firstLineChars="0"/>
+              <w:rPr>
+                <w:rFonts w:ascii="Arial" w:hAnsi="Arial" w:eastAsia="Arial" w:cs="Arial"/>
+                <w:i w:val="false"/>
+                <w:b w:val="false"/>
+                <w:u w:val="none"/>
+                <w:strike w:val="false"/>
+                <w:sz w:val="18"/>
+                <w:szCs w:val="18"/>
+                <w:color w:val="000000"/>
+              </w:rPr>
+            </w:pPr>
+            <w:r>
+              <w:rPr>
+                <w:rFonts w:ascii="Arial" w:hAnsi="Arial" w:eastAsia="Arial" w:cs="Arial"/>
+                <w:i w:val="false"/>
+                <w:b w:val="false"/>
+                <w:u w:val="none"/>
+                <w:strike w:val="false"/>
+                <w:sz w:val="18"/>
+                <w:szCs w:val="18"/>
+                <w:color w:val="000000"/>
+              </w:rPr>
+              <w:t xml:space="preserve">64.1 (50.0–77.8)</w:t>
+            </w:r>
+          </w:p>
+        </w:tc>
+        <w:tc>
+          <w:tcPr>
+            <w:tcBorders>
+              <w:bottom w:val="none" w:sz="0" w:space="0" w:color="000000"/>
+              <w:top w:val="none" w:sz="0" w:space="0" w:color="000000"/>
+              <w:left w:val="none" w:sz="0" w:space="0" w:color="000000"/>
+              <w:right w:val="none" w:sz="0" w:space="0" w:color="000000"/>
+            </w:tcBorders>
+            <w:shd w:val="clear" w:color="auto" w:fill="FFFFFF"/>
+            <w:tcMar>
+              <w:top w:w="0" w:type="dxa"/>
+              <w:bottom w:w="0" w:type="dxa"/>
+              <w:left w:w="0" w:type="dxa"/>
+              <w:right w:w="0" w:type="dxa"/>
+            </w:tcMar>
+            <w:vAlign w:val="top"/>
+          </w:tcPr>
+          <w:p>
+            <w:pPr>
+              <w:pStyle w:val="Normal"/>
+              <w:jc w:val="left"/>
+              <w:pBdr>
+                <w:bottom w:val="none" w:sz="0" w:space="0" w:color="000000"/>
+                <w:top w:val="none" w:sz="0" w:space="0" w:color="000000"/>
+                <w:left w:val="none" w:sz="0" w:space="0" w:color="000000"/>
+                <w:right w:val="none" w:sz="0" w:space="0" w:color="000000"/>
+              </w:pBdr>
+              <w:spacing w:after="60" w:before="60" w:line="240"/>
+              <w:ind w:left="60" w:right="60" w:firstLine="0" w:firstLineChars="0"/>
+              <w:rPr>
+                <w:rFonts w:ascii="Arial" w:hAnsi="Arial" w:eastAsia="Arial" w:cs="Arial"/>
+                <w:i w:val="false"/>
+                <w:b w:val="false"/>
+                <w:u w:val="none"/>
+                <w:strike w:val="false"/>
+                <w:sz w:val="18"/>
+                <w:szCs w:val="18"/>
+                <w:color w:val="000000"/>
+              </w:rPr>
+            </w:pPr>
+            <w:r>
+              <w:rPr>
+                <w:rFonts w:ascii="Arial" w:hAnsi="Arial" w:eastAsia="Arial" w:cs="Arial"/>
+                <w:i w:val="false"/>
+                <w:b w:val="false"/>
+                <w:u w:val="none"/>
+                <w:strike w:val="false"/>
+                <w:sz w:val="18"/>
+                <w:szCs w:val="18"/>
+                <w:color w:val="000000"/>
+              </w:rPr>
+              <w:t xml:space="preserve">76.2 (65.9–86.8)</w:t>
             </w:r>
           </w:p>
         </w:tc>
@@ -2392,7 +2392,7 @@
                 <w:szCs w:val="18"/>
                 <w:color w:val="000000"/>
               </w:rPr>
-              <w:t xml:space="preserve">42/81 (51.9%) (44.4–59.3)</w:t>
+              <w:t xml:space="preserve">51.9 (44.4–59.3)</w:t>
             </w:r>
           </w:p>
         </w:tc>
@@ -2502,7 +2502,7 @@
                 <w:szCs w:val="18"/>
                 <w:color w:val="000000"/>
               </w:rPr>
-              <w:t xml:space="preserve">42/42 (100.0%)</w:t>
+              <w:t xml:space="preserve">100.0</w:t>
             </w:r>
           </w:p>
         </w:tc>
@@ -2790,7 +2790,7 @@
                 <w:szCs w:val="18"/>
                 <w:color w:val="000000"/>
               </w:rPr>
-              <w:t xml:space="preserve">472/485 (97.3%) (95.9–98.6)</w:t>
+              <w:t xml:space="preserve">97.3 (95.9–98.6)</w:t>
             </w:r>
           </w:p>
         </w:tc>
@@ -3126,7 +3126,7 @@
                 <w:szCs w:val="18"/>
                 <w:color w:val="000000"/>
               </w:rPr>
-              <w:t xml:space="preserve">425/485 (87.6%) (85.2–90.0)</w:t>
+              <w:t xml:space="preserve">87.6 (85.2–90.0)</w:t>
             </w:r>
           </w:p>
         </w:tc>
@@ -4374,7 +4374,7 @@
                 <w:szCs w:val="18"/>
                 <w:color w:val="000000"/>
               </w:rPr>
-              <w:t xml:space="preserve">Linearly weighted Cohen’s κ and Gwet’s AC2. Exact agreement, sensitivity and specificity are n/N (%); their CI bounds are percentages. Not Low means Some concerns or High. All-Low rule has no variance; only accuracy and specificity are reported. Paired differences are on the coefficient scale or in percentage points; — indicates undefined or not applicable. Composite reference: consensus preferred judgement on consensus cells, Published on other cells; 25 split cells excluded (485 cells per arm). Adjudicators could only choose among the three labels offered. Cells where both Sonnet arms matched Published were never adjudicated and are assumed correct. Both features inflate absolute composite values. CI, confidence interval; 10,000 percentile bootstrap replicates, trials resampled within meta-analysis; seed 20261018.</w:t>
+              <w:t xml:space="preserve">Values are coefficients or percentages (95% CI); denominators are in block labels. Not Low means Some concerns or High. All-Low rule has no variance; only accuracy and specificity are reported. Paired differences are coefficients or percentage points; — indicates undefined or not applicable. Composite reference: consensus preferred judgement on consensus cells, Published on other cells; 25 split cells excluded (485 cells per arm). Adjudicators could only choose among the three labels offered. Cells where both Sonnet arms matched Published were never adjudicated and are assumed correct. Both features inflate absolute composite values. Overall judgements were not adjudicated. Published labels were frequently less severe than the adjudicators’ preferred judgement (Figure 4). CI, confidence interval; 10,000 percentile bootstrap replicates, trials resampled within meta-analysis; seed 20261018.</w:t>
             </w:r>
           </w:p>
         </w:tc>

</xml_diff>

<commit_message>
Regenerate round 11B-3 publication outputs and document QA
</commit_message>
<xml_diff>
--- a/analysis/output/manuscript/Table2.docx
+++ b/analysis/output/manuscript/Table2.docx
@@ -17,12 +17,12 @@
         <w:tblLook w:firstRow="1" w:lastRow="0" w:firstColumn="0" w:lastColumn="0" w:noHBand="0" w:noVBand="1"/>
       </w:tblPr>
       <w:tblGrid>
-        <w:gridCol w:w="1656"/>
-        <w:gridCol w:w="1152"/>
-        <w:gridCol w:w="1152"/>
-        <w:gridCol w:w="1944"/>
-        <w:gridCol w:w="1944"/>
-        <w:gridCol w:w="1584"/>
+        <w:gridCol w:w="1469"/>
+        <w:gridCol w:w="1699"/>
+        <w:gridCol w:w="1814"/>
+        <w:gridCol w:w="1598"/>
+        <w:gridCol w:w="1555"/>
+        <w:gridCol w:w="1814"/>
       </w:tblGrid>
       <w:tr>
         <w:trPr>
@@ -59,7 +59,7 @@
                 <w:right w:val="none" w:sz="0" w:space="0" w:color="000000"/>
               </w:pBdr>
               <w:spacing w:after="60" w:before="60" w:line="240"/>
-              <w:ind w:left="60" w:right="60" w:firstLine="0" w:firstLineChars="0"/>
+              <w:ind w:left="40" w:right="40" w:firstLine="0" w:firstLineChars="0"/>
               <w:rPr>
                 <w:rFonts w:ascii="Arial" w:hAnsi="Arial" w:eastAsia="Arial" w:cs="Arial"/>
                 <w:i w:val="false"/>
@@ -115,7 +115,7 @@
                 <w:right w:val="none" w:sz="0" w:space="0" w:color="000000"/>
               </w:pBdr>
               <w:spacing w:after="60" w:before="60" w:line="240"/>
-              <w:ind w:left="60" w:right="60" w:firstLine="0" w:firstLineChars="0"/>
+              <w:ind w:left="40" w:right="40" w:firstLine="0" w:firstLineChars="0"/>
               <w:rPr>
                 <w:rFonts w:ascii="Arial" w:hAnsi="Arial" w:eastAsia="Arial" w:cs="Arial"/>
                 <w:i w:val="false"/>
@@ -171,7 +171,7 @@
                 <w:right w:val="none" w:sz="0" w:space="0" w:color="000000"/>
               </w:pBdr>
               <w:spacing w:after="60" w:before="60" w:line="240"/>
-              <w:ind w:left="60" w:right="60" w:firstLine="0" w:firstLineChars="0"/>
+              <w:ind w:left="40" w:right="40" w:firstLine="0" w:firstLineChars="0"/>
               <w:rPr>
                 <w:rFonts w:ascii="Arial" w:hAnsi="Arial" w:eastAsia="Arial" w:cs="Arial"/>
                 <w:i w:val="false"/>
@@ -227,7 +227,7 @@
                 <w:right w:val="none" w:sz="0" w:space="0" w:color="000000"/>
               </w:pBdr>
               <w:spacing w:after="60" w:before="60" w:line="240"/>
-              <w:ind w:left="60" w:right="60" w:firstLine="0" w:firstLineChars="0"/>
+              <w:ind w:left="40" w:right="40" w:firstLine="0" w:firstLineChars="0"/>
               <w:rPr>
                 <w:rFonts w:ascii="Arial" w:hAnsi="Arial" w:eastAsia="Arial" w:cs="Arial"/>
                 <w:i w:val="false"/>
@@ -283,7 +283,7 @@
                 <w:right w:val="none" w:sz="0" w:space="0" w:color="000000"/>
               </w:pBdr>
               <w:spacing w:after="60" w:before="60" w:line="240"/>
-              <w:ind w:left="60" w:right="60" w:firstLine="0" w:firstLineChars="0"/>
+              <w:ind w:left="40" w:right="40" w:firstLine="0" w:firstLineChars="0"/>
               <w:rPr>
                 <w:rFonts w:ascii="Arial" w:hAnsi="Arial" w:eastAsia="Arial" w:cs="Arial"/>
                 <w:i w:val="false"/>
@@ -339,7 +339,7 @@
                 <w:right w:val="none" w:sz="0" w:space="0" w:color="000000"/>
               </w:pBdr>
               <w:spacing w:after="60" w:before="60" w:line="240"/>
-              <w:ind w:left="60" w:right="60" w:firstLine="0" w:firstLineChars="0"/>
+              <w:ind w:left="40" w:right="40" w:firstLine="0" w:firstLineChars="0"/>
               <w:rPr>
                 <w:rFonts w:ascii="Arial" w:hAnsi="Arial" w:eastAsia="Arial" w:cs="Arial"/>
                 <w:i w:val="false"/>
@@ -401,7 +401,7 @@
                 <w:right w:val="none" w:sz="0" w:space="0" w:color="000000"/>
               </w:pBdr>
               <w:spacing w:after="60" w:before="60" w:line="240"/>
-              <w:ind w:left="60" w:right="60" w:firstLine="0" w:firstLineChars="0"/>
+              <w:ind w:left="40" w:right="40" w:firstLine="0" w:firstLineChars="0"/>
               <w:rPr>
                 <w:rFonts w:ascii="Arial" w:hAnsi="Arial" w:eastAsia="Arial" w:cs="Arial"/>
                 <w:i w:val="false"/>
@@ -462,7 +462,7 @@
                 <w:right w:val="none" w:sz="0" w:space="0" w:color="000000"/>
               </w:pBdr>
               <w:spacing w:after="60" w:before="60" w:line="240"/>
-              <w:ind w:left="60" w:right="60" w:firstLine="0" w:firstLineChars="0"/>
+              <w:ind w:left="40" w:right="40" w:firstLine="0" w:firstLineChars="0"/>
               <w:rPr>
                 <w:rFonts w:ascii="Arial" w:hAnsi="Arial" w:eastAsia="Arial" w:cs="Arial"/>
                 <w:i w:val="false"/>
@@ -517,7 +517,7 @@
                 <w:right w:val="none" w:sz="0" w:space="0" w:color="000000"/>
               </w:pBdr>
               <w:spacing w:after="60" w:before="60" w:line="240"/>
-              <w:ind w:left="60" w:right="60" w:firstLine="0" w:firstLineChars="0"/>
+              <w:ind w:left="40" w:right="40" w:firstLine="0" w:firstLineChars="0"/>
               <w:rPr>
                 <w:rFonts w:ascii="Arial" w:hAnsi="Arial" w:eastAsia="Arial" w:cs="Arial"/>
                 <w:i w:val="false"/>
@@ -572,7 +572,7 @@
                 <w:right w:val="none" w:sz="0" w:space="0" w:color="000000"/>
               </w:pBdr>
               <w:spacing w:after="60" w:before="60" w:line="240"/>
-              <w:ind w:left="60" w:right="60" w:firstLine="0" w:firstLineChars="0"/>
+              <w:ind w:left="40" w:right="40" w:firstLine="0" w:firstLineChars="0"/>
               <w:rPr>
                 <w:rFonts w:ascii="Arial" w:hAnsi="Arial" w:eastAsia="Arial" w:cs="Arial"/>
                 <w:i w:val="false"/>
@@ -627,7 +627,7 @@
                 <w:right w:val="none" w:sz="0" w:space="0" w:color="000000"/>
               </w:pBdr>
               <w:spacing w:after="60" w:before="60" w:line="240"/>
-              <w:ind w:left="60" w:right="60" w:firstLine="0" w:firstLineChars="0"/>
+              <w:ind w:left="40" w:right="40" w:firstLine="0" w:firstLineChars="0"/>
               <w:rPr>
                 <w:rFonts w:ascii="Arial" w:hAnsi="Arial" w:eastAsia="Arial" w:cs="Arial"/>
                 <w:i w:val="false"/>
@@ -682,7 +682,7 @@
                 <w:right w:val="none" w:sz="0" w:space="0" w:color="000000"/>
               </w:pBdr>
               <w:spacing w:after="60" w:before="60" w:line="240"/>
-              <w:ind w:left="60" w:right="60" w:firstLine="0" w:firstLineChars="0"/>
+              <w:ind w:left="40" w:right="40" w:firstLine="0" w:firstLineChars="0"/>
               <w:rPr>
                 <w:rFonts w:ascii="Arial" w:hAnsi="Arial" w:eastAsia="Arial" w:cs="Arial"/>
                 <w:i w:val="false"/>
@@ -737,7 +737,7 @@
                 <w:right w:val="none" w:sz="0" w:space="0" w:color="000000"/>
               </w:pBdr>
               <w:spacing w:after="60" w:before="60" w:line="240"/>
-              <w:ind w:left="60" w:right="60" w:firstLine="0" w:firstLineChars="0"/>
+              <w:ind w:left="40" w:right="40" w:firstLine="0" w:firstLineChars="0"/>
               <w:rPr>
                 <w:rFonts w:ascii="Arial" w:hAnsi="Arial" w:eastAsia="Arial" w:cs="Arial"/>
                 <w:i w:val="false"/>
@@ -798,7 +798,7 @@
                 <w:right w:val="none" w:sz="0" w:space="0" w:color="000000"/>
               </w:pBdr>
               <w:spacing w:after="60" w:before="60" w:line="240"/>
-              <w:ind w:left="60" w:right="60" w:firstLine="0" w:firstLineChars="0"/>
+              <w:ind w:left="40" w:right="40" w:firstLine="0" w:firstLineChars="0"/>
               <w:rPr>
                 <w:rFonts w:ascii="Arial" w:hAnsi="Arial" w:eastAsia="Arial" w:cs="Arial"/>
                 <w:i w:val="false"/>
@@ -853,7 +853,7 @@
                 <w:right w:val="none" w:sz="0" w:space="0" w:color="000000"/>
               </w:pBdr>
               <w:spacing w:after="60" w:before="60" w:line="240"/>
-              <w:ind w:left="60" w:right="60" w:firstLine="0" w:firstLineChars="0"/>
+              <w:ind w:left="40" w:right="40" w:firstLine="0" w:firstLineChars="0"/>
               <w:rPr>
                 <w:rFonts w:ascii="Arial" w:hAnsi="Arial" w:eastAsia="Arial" w:cs="Arial"/>
                 <w:i w:val="false"/>
@@ -908,7 +908,7 @@
                 <w:right w:val="none" w:sz="0" w:space="0" w:color="000000"/>
               </w:pBdr>
               <w:spacing w:after="60" w:before="60" w:line="240"/>
-              <w:ind w:left="60" w:right="60" w:firstLine="0" w:firstLineChars="0"/>
+              <w:ind w:left="40" w:right="40" w:firstLine="0" w:firstLineChars="0"/>
               <w:rPr>
                 <w:rFonts w:ascii="Arial" w:hAnsi="Arial" w:eastAsia="Arial" w:cs="Arial"/>
                 <w:i w:val="false"/>
@@ -963,7 +963,7 @@
                 <w:right w:val="none" w:sz="0" w:space="0" w:color="000000"/>
               </w:pBdr>
               <w:spacing w:after="60" w:before="60" w:line="240"/>
-              <w:ind w:left="60" w:right="60" w:firstLine="0" w:firstLineChars="0"/>
+              <w:ind w:left="40" w:right="40" w:firstLine="0" w:firstLineChars="0"/>
               <w:rPr>
                 <w:rFonts w:ascii="Arial" w:hAnsi="Arial" w:eastAsia="Arial" w:cs="Arial"/>
                 <w:i w:val="false"/>
@@ -1018,7 +1018,7 @@
                 <w:right w:val="none" w:sz="0" w:space="0" w:color="000000"/>
               </w:pBdr>
               <w:spacing w:after="60" w:before="60" w:line="240"/>
-              <w:ind w:left="60" w:right="60" w:firstLine="0" w:firstLineChars="0"/>
+              <w:ind w:left="40" w:right="40" w:firstLine="0" w:firstLineChars="0"/>
               <w:rPr>
                 <w:rFonts w:ascii="Arial" w:hAnsi="Arial" w:eastAsia="Arial" w:cs="Arial"/>
                 <w:i w:val="false"/>
@@ -1073,7 +1073,7 @@
                 <w:right w:val="none" w:sz="0" w:space="0" w:color="000000"/>
               </w:pBdr>
               <w:spacing w:after="60" w:before="60" w:line="240"/>
-              <w:ind w:left="60" w:right="60" w:firstLine="0" w:firstLineChars="0"/>
+              <w:ind w:left="40" w:right="40" w:firstLine="0" w:firstLineChars="0"/>
               <w:rPr>
                 <w:rFonts w:ascii="Arial" w:hAnsi="Arial" w:eastAsia="Arial" w:cs="Arial"/>
                 <w:i w:val="false"/>
@@ -1134,7 +1134,7 @@
                 <w:right w:val="none" w:sz="0" w:space="0" w:color="000000"/>
               </w:pBdr>
               <w:spacing w:after="60" w:before="60" w:line="240"/>
-              <w:ind w:left="60" w:right="60" w:firstLine="0" w:firstLineChars="0"/>
+              <w:ind w:left="40" w:right="40" w:firstLine="0" w:firstLineChars="0"/>
               <w:rPr>
                 <w:rFonts w:ascii="Arial" w:hAnsi="Arial" w:eastAsia="Arial" w:cs="Arial"/>
                 <w:i w:val="false"/>
@@ -1189,7 +1189,7 @@
                 <w:right w:val="none" w:sz="0" w:space="0" w:color="000000"/>
               </w:pBdr>
               <w:spacing w:after="60" w:before="60" w:line="240"/>
-              <w:ind w:left="60" w:right="60" w:firstLine="0" w:firstLineChars="0"/>
+              <w:ind w:left="40" w:right="40" w:firstLine="0" w:firstLineChars="0"/>
               <w:rPr>
                 <w:rFonts w:ascii="Arial" w:hAnsi="Arial" w:eastAsia="Arial" w:cs="Arial"/>
                 <w:i w:val="false"/>
@@ -1244,7 +1244,7 @@
                 <w:right w:val="none" w:sz="0" w:space="0" w:color="000000"/>
               </w:pBdr>
               <w:spacing w:after="60" w:before="60" w:line="240"/>
-              <w:ind w:left="60" w:right="60" w:firstLine="0" w:firstLineChars="0"/>
+              <w:ind w:left="40" w:right="40" w:firstLine="0" w:firstLineChars="0"/>
               <w:rPr>
                 <w:rFonts w:ascii="Arial" w:hAnsi="Arial" w:eastAsia="Arial" w:cs="Arial"/>
                 <w:i w:val="false"/>
@@ -1299,7 +1299,7 @@
                 <w:right w:val="none" w:sz="0" w:space="0" w:color="000000"/>
               </w:pBdr>
               <w:spacing w:after="60" w:before="60" w:line="240"/>
-              <w:ind w:left="60" w:right="60" w:firstLine="0" w:firstLineChars="0"/>
+              <w:ind w:left="40" w:right="40" w:firstLine="0" w:firstLineChars="0"/>
               <w:rPr>
                 <w:rFonts w:ascii="Arial" w:hAnsi="Arial" w:eastAsia="Arial" w:cs="Arial"/>
                 <w:i w:val="false"/>
@@ -1354,7 +1354,7 @@
                 <w:right w:val="none" w:sz="0" w:space="0" w:color="000000"/>
               </w:pBdr>
               <w:spacing w:after="60" w:before="60" w:line="240"/>
-              <w:ind w:left="60" w:right="60" w:firstLine="0" w:firstLineChars="0"/>
+              <w:ind w:left="40" w:right="40" w:firstLine="0" w:firstLineChars="0"/>
               <w:rPr>
                 <w:rFonts w:ascii="Arial" w:hAnsi="Arial" w:eastAsia="Arial" w:cs="Arial"/>
                 <w:i w:val="false"/>
@@ -1409,7 +1409,7 @@
                 <w:right w:val="none" w:sz="0" w:space="0" w:color="000000"/>
               </w:pBdr>
               <w:spacing w:after="60" w:before="60" w:line="240"/>
-              <w:ind w:left="60" w:right="60" w:firstLine="0" w:firstLineChars="0"/>
+              <w:ind w:left="40" w:right="40" w:firstLine="0" w:firstLineChars="0"/>
               <w:rPr>
                 <w:rFonts w:ascii="Arial" w:hAnsi="Arial" w:eastAsia="Arial" w:cs="Arial"/>
                 <w:i w:val="false"/>
@@ -1471,7 +1471,7 @@
                 <w:right w:val="none" w:sz="0" w:space="0" w:color="000000"/>
               </w:pBdr>
               <w:spacing w:after="60" w:before="60" w:line="240"/>
-              <w:ind w:left="60" w:right="60" w:firstLine="0" w:firstLineChars="0"/>
+              <w:ind w:left="40" w:right="40" w:firstLine="0" w:firstLineChars="0"/>
               <w:rPr>
                 <w:rFonts w:ascii="Arial" w:hAnsi="Arial" w:eastAsia="Arial" w:cs="Arial"/>
                 <w:i w:val="false"/>
@@ -1532,7 +1532,7 @@
                 <w:right w:val="none" w:sz="0" w:space="0" w:color="000000"/>
               </w:pBdr>
               <w:spacing w:after="60" w:before="60" w:line="240"/>
-              <w:ind w:left="60" w:right="60" w:firstLine="0" w:firstLineChars="0"/>
+              <w:ind w:left="40" w:right="40" w:firstLine="0" w:firstLineChars="0"/>
               <w:rPr>
                 <w:rFonts w:ascii="Arial" w:hAnsi="Arial" w:eastAsia="Arial" w:cs="Arial"/>
                 <w:i w:val="false"/>
@@ -1587,7 +1587,7 @@
                 <w:right w:val="none" w:sz="0" w:space="0" w:color="000000"/>
               </w:pBdr>
               <w:spacing w:after="60" w:before="60" w:line="240"/>
-              <w:ind w:left="60" w:right="60" w:firstLine="0" w:firstLineChars="0"/>
+              <w:ind w:left="40" w:right="40" w:firstLine="0" w:firstLineChars="0"/>
               <w:rPr>
                 <w:rFonts w:ascii="Arial" w:hAnsi="Arial" w:eastAsia="Arial" w:cs="Arial"/>
                 <w:i w:val="false"/>
@@ -1642,7 +1642,7 @@
                 <w:right w:val="none" w:sz="0" w:space="0" w:color="000000"/>
               </w:pBdr>
               <w:spacing w:after="60" w:before="60" w:line="240"/>
-              <w:ind w:left="60" w:right="60" w:firstLine="0" w:firstLineChars="0"/>
+              <w:ind w:left="40" w:right="40" w:firstLine="0" w:firstLineChars="0"/>
               <w:rPr>
                 <w:rFonts w:ascii="Arial" w:hAnsi="Arial" w:eastAsia="Arial" w:cs="Arial"/>
                 <w:i w:val="false"/>
@@ -1697,7 +1697,7 @@
                 <w:right w:val="none" w:sz="0" w:space="0" w:color="000000"/>
               </w:pBdr>
               <w:spacing w:after="60" w:before="60" w:line="240"/>
-              <w:ind w:left="60" w:right="60" w:firstLine="0" w:firstLineChars="0"/>
+              <w:ind w:left="40" w:right="40" w:firstLine="0" w:firstLineChars="0"/>
               <w:rPr>
                 <w:rFonts w:ascii="Arial" w:hAnsi="Arial" w:eastAsia="Arial" w:cs="Arial"/>
                 <w:i w:val="false"/>
@@ -1752,7 +1752,7 @@
                 <w:right w:val="none" w:sz="0" w:space="0" w:color="000000"/>
               </w:pBdr>
               <w:spacing w:after="60" w:before="60" w:line="240"/>
-              <w:ind w:left="60" w:right="60" w:firstLine="0" w:firstLineChars="0"/>
+              <w:ind w:left="40" w:right="40" w:firstLine="0" w:firstLineChars="0"/>
               <w:rPr>
                 <w:rFonts w:ascii="Arial" w:hAnsi="Arial" w:eastAsia="Arial" w:cs="Arial"/>
                 <w:i w:val="false"/>
@@ -1807,7 +1807,7 @@
                 <w:right w:val="none" w:sz="0" w:space="0" w:color="000000"/>
               </w:pBdr>
               <w:spacing w:after="60" w:before="60" w:line="240"/>
-              <w:ind w:left="60" w:right="60" w:firstLine="0" w:firstLineChars="0"/>
+              <w:ind w:left="40" w:right="40" w:firstLine="0" w:firstLineChars="0"/>
               <w:rPr>
                 <w:rFonts w:ascii="Arial" w:hAnsi="Arial" w:eastAsia="Arial" w:cs="Arial"/>
                 <w:i w:val="false"/>
@@ -1868,7 +1868,7 @@
                 <w:right w:val="none" w:sz="0" w:space="0" w:color="000000"/>
               </w:pBdr>
               <w:spacing w:after="60" w:before="60" w:line="240"/>
-              <w:ind w:left="60" w:right="60" w:firstLine="0" w:firstLineChars="0"/>
+              <w:ind w:left="40" w:right="40" w:firstLine="0" w:firstLineChars="0"/>
               <w:rPr>
                 <w:rFonts w:ascii="Arial" w:hAnsi="Arial" w:eastAsia="Arial" w:cs="Arial"/>
                 <w:i w:val="false"/>
@@ -1923,7 +1923,7 @@
                 <w:right w:val="none" w:sz="0" w:space="0" w:color="000000"/>
               </w:pBdr>
               <w:spacing w:after="60" w:before="60" w:line="240"/>
-              <w:ind w:left="60" w:right="60" w:firstLine="0" w:firstLineChars="0"/>
+              <w:ind w:left="40" w:right="40" w:firstLine="0" w:firstLineChars="0"/>
               <w:rPr>
                 <w:rFonts w:ascii="Arial" w:hAnsi="Arial" w:eastAsia="Arial" w:cs="Arial"/>
                 <w:i w:val="false"/>
@@ -1978,7 +1978,7 @@
                 <w:right w:val="none" w:sz="0" w:space="0" w:color="000000"/>
               </w:pBdr>
               <w:spacing w:after="60" w:before="60" w:line="240"/>
-              <w:ind w:left="60" w:right="60" w:firstLine="0" w:firstLineChars="0"/>
+              <w:ind w:left="40" w:right="40" w:firstLine="0" w:firstLineChars="0"/>
               <w:rPr>
                 <w:rFonts w:ascii="Arial" w:hAnsi="Arial" w:eastAsia="Arial" w:cs="Arial"/>
                 <w:i w:val="false"/>
@@ -2033,7 +2033,7 @@
                 <w:right w:val="none" w:sz="0" w:space="0" w:color="000000"/>
               </w:pBdr>
               <w:spacing w:after="60" w:before="60" w:line="240"/>
-              <w:ind w:left="60" w:right="60" w:firstLine="0" w:firstLineChars="0"/>
+              <w:ind w:left="40" w:right="40" w:firstLine="0" w:firstLineChars="0"/>
               <w:rPr>
                 <w:rFonts w:ascii="Arial" w:hAnsi="Arial" w:eastAsia="Arial" w:cs="Arial"/>
                 <w:i w:val="false"/>
@@ -2088,7 +2088,7 @@
                 <w:right w:val="none" w:sz="0" w:space="0" w:color="000000"/>
               </w:pBdr>
               <w:spacing w:after="60" w:before="60" w:line="240"/>
-              <w:ind w:left="60" w:right="60" w:firstLine="0" w:firstLineChars="0"/>
+              <w:ind w:left="40" w:right="40" w:firstLine="0" w:firstLineChars="0"/>
               <w:rPr>
                 <w:rFonts w:ascii="Arial" w:hAnsi="Arial" w:eastAsia="Arial" w:cs="Arial"/>
                 <w:i w:val="false"/>
@@ -2143,7 +2143,7 @@
                 <w:right w:val="none" w:sz="0" w:space="0" w:color="000000"/>
               </w:pBdr>
               <w:spacing w:after="60" w:before="60" w:line="240"/>
-              <w:ind w:left="60" w:right="60" w:firstLine="0" w:firstLineChars="0"/>
+              <w:ind w:left="40" w:right="40" w:firstLine="0" w:firstLineChars="0"/>
               <w:rPr>
                 <w:rFonts w:ascii="Arial" w:hAnsi="Arial" w:eastAsia="Arial" w:cs="Arial"/>
                 <w:i w:val="false"/>
@@ -2204,7 +2204,7 @@
                 <w:right w:val="none" w:sz="0" w:space="0" w:color="000000"/>
               </w:pBdr>
               <w:spacing w:after="60" w:before="60" w:line="240"/>
-              <w:ind w:left="60" w:right="60" w:firstLine="0" w:firstLineChars="0"/>
+              <w:ind w:left="40" w:right="40" w:firstLine="0" w:firstLineChars="0"/>
               <w:rPr>
                 <w:rFonts w:ascii="Arial" w:hAnsi="Arial" w:eastAsia="Arial" w:cs="Arial"/>
                 <w:i w:val="false"/>
@@ -2259,7 +2259,7 @@
                 <w:right w:val="none" w:sz="0" w:space="0" w:color="000000"/>
               </w:pBdr>
               <w:spacing w:after="60" w:before="60" w:line="240"/>
-              <w:ind w:left="60" w:right="60" w:firstLine="0" w:firstLineChars="0"/>
+              <w:ind w:left="40" w:right="40" w:firstLine="0" w:firstLineChars="0"/>
               <w:rPr>
                 <w:rFonts w:ascii="Arial" w:hAnsi="Arial" w:eastAsia="Arial" w:cs="Arial"/>
                 <w:i w:val="false"/>
@@ -2314,7 +2314,7 @@
                 <w:right w:val="none" w:sz="0" w:space="0" w:color="000000"/>
               </w:pBdr>
               <w:spacing w:after="60" w:before="60" w:line="240"/>
-              <w:ind w:left="60" w:right="60" w:firstLine="0" w:firstLineChars="0"/>
+              <w:ind w:left="40" w:right="40" w:firstLine="0" w:firstLineChars="0"/>
               <w:rPr>
                 <w:rFonts w:ascii="Arial" w:hAnsi="Arial" w:eastAsia="Arial" w:cs="Arial"/>
                 <w:i w:val="false"/>
@@ -2369,7 +2369,7 @@
                 <w:right w:val="none" w:sz="0" w:space="0" w:color="000000"/>
               </w:pBdr>
               <w:spacing w:after="60" w:before="60" w:line="240"/>
-              <w:ind w:left="60" w:right="60" w:firstLine="0" w:firstLineChars="0"/>
+              <w:ind w:left="40" w:right="40" w:firstLine="0" w:firstLineChars="0"/>
               <w:rPr>
                 <w:rFonts w:ascii="Arial" w:hAnsi="Arial" w:eastAsia="Arial" w:cs="Arial"/>
                 <w:i w:val="false"/>
@@ -2424,7 +2424,7 @@
                 <w:right w:val="none" w:sz="0" w:space="0" w:color="000000"/>
               </w:pBdr>
               <w:spacing w:after="60" w:before="60" w:line="240"/>
-              <w:ind w:left="60" w:right="60" w:firstLine="0" w:firstLineChars="0"/>
+              <w:ind w:left="40" w:right="40" w:firstLine="0" w:firstLineChars="0"/>
               <w:rPr>
                 <w:rFonts w:ascii="Arial" w:hAnsi="Arial" w:eastAsia="Arial" w:cs="Arial"/>
                 <w:i w:val="false"/>
@@ -2479,7 +2479,7 @@
                 <w:right w:val="none" w:sz="0" w:space="0" w:color="000000"/>
               </w:pBdr>
               <w:spacing w:after="60" w:before="60" w:line="240"/>
-              <w:ind w:left="60" w:right="60" w:firstLine="0" w:firstLineChars="0"/>
+              <w:ind w:left="40" w:right="40" w:firstLine="0" w:firstLineChars="0"/>
               <w:rPr>
                 <w:rFonts w:ascii="Arial" w:hAnsi="Arial" w:eastAsia="Arial" w:cs="Arial"/>
                 <w:i w:val="false"/>
@@ -2541,7 +2541,7 @@
                 <w:right w:val="none" w:sz="0" w:space="0" w:color="000000"/>
               </w:pBdr>
               <w:spacing w:after="60" w:before="60" w:line="240"/>
-              <w:ind w:left="60" w:right="60" w:firstLine="0" w:firstLineChars="0"/>
+              <w:ind w:left="40" w:right="40" w:firstLine="0" w:firstLineChars="0"/>
               <w:rPr>
                 <w:rFonts w:ascii="Arial" w:hAnsi="Arial" w:eastAsia="Arial" w:cs="Arial"/>
                 <w:i w:val="false"/>
@@ -2602,7 +2602,7 @@
                 <w:right w:val="none" w:sz="0" w:space="0" w:color="000000"/>
               </w:pBdr>
               <w:spacing w:after="60" w:before="60" w:line="240"/>
-              <w:ind w:left="60" w:right="60" w:firstLine="0" w:firstLineChars="0"/>
+              <w:ind w:left="40" w:right="40" w:firstLine="0" w:firstLineChars="0"/>
               <w:rPr>
                 <w:rFonts w:ascii="Arial" w:hAnsi="Arial" w:eastAsia="Arial" w:cs="Arial"/>
                 <w:i w:val="false"/>
@@ -2657,7 +2657,7 @@
                 <w:right w:val="none" w:sz="0" w:space="0" w:color="000000"/>
               </w:pBdr>
               <w:spacing w:after="60" w:before="60" w:line="240"/>
-              <w:ind w:left="60" w:right="60" w:firstLine="0" w:firstLineChars="0"/>
+              <w:ind w:left="40" w:right="40" w:firstLine="0" w:firstLineChars="0"/>
               <w:rPr>
                 <w:rFonts w:ascii="Arial" w:hAnsi="Arial" w:eastAsia="Arial" w:cs="Arial"/>
                 <w:i w:val="false"/>
@@ -2712,7 +2712,7 @@
                 <w:right w:val="none" w:sz="0" w:space="0" w:color="000000"/>
               </w:pBdr>
               <w:spacing w:after="60" w:before="60" w:line="240"/>
-              <w:ind w:left="60" w:right="60" w:firstLine="0" w:firstLineChars="0"/>
+              <w:ind w:left="40" w:right="40" w:firstLine="0" w:firstLineChars="0"/>
               <w:rPr>
                 <w:rFonts w:ascii="Arial" w:hAnsi="Arial" w:eastAsia="Arial" w:cs="Arial"/>
                 <w:i w:val="false"/>
@@ -2767,7 +2767,7 @@
                 <w:right w:val="none" w:sz="0" w:space="0" w:color="000000"/>
               </w:pBdr>
               <w:spacing w:after="60" w:before="60" w:line="240"/>
-              <w:ind w:left="60" w:right="60" w:firstLine="0" w:firstLineChars="0"/>
+              <w:ind w:left="40" w:right="40" w:firstLine="0" w:firstLineChars="0"/>
               <w:rPr>
                 <w:rFonts w:ascii="Arial" w:hAnsi="Arial" w:eastAsia="Arial" w:cs="Arial"/>
                 <w:i w:val="false"/>
@@ -2822,7 +2822,7 @@
                 <w:right w:val="none" w:sz="0" w:space="0" w:color="000000"/>
               </w:pBdr>
               <w:spacing w:after="60" w:before="60" w:line="240"/>
-              <w:ind w:left="60" w:right="60" w:firstLine="0" w:firstLineChars="0"/>
+              <w:ind w:left="40" w:right="40" w:firstLine="0" w:firstLineChars="0"/>
               <w:rPr>
                 <w:rFonts w:ascii="Arial" w:hAnsi="Arial" w:eastAsia="Arial" w:cs="Arial"/>
                 <w:i w:val="false"/>
@@ -2877,7 +2877,7 @@
                 <w:right w:val="none" w:sz="0" w:space="0" w:color="000000"/>
               </w:pBdr>
               <w:spacing w:after="60" w:before="60" w:line="240"/>
-              <w:ind w:left="60" w:right="60" w:firstLine="0" w:firstLineChars="0"/>
+              <w:ind w:left="40" w:right="40" w:firstLine="0" w:firstLineChars="0"/>
               <w:rPr>
                 <w:rFonts w:ascii="Arial" w:hAnsi="Arial" w:eastAsia="Arial" w:cs="Arial"/>
                 <w:i w:val="false"/>
@@ -2938,7 +2938,7 @@
                 <w:right w:val="none" w:sz="0" w:space="0" w:color="000000"/>
               </w:pBdr>
               <w:spacing w:after="60" w:before="60" w:line="240"/>
-              <w:ind w:left="60" w:right="60" w:firstLine="0" w:firstLineChars="0"/>
+              <w:ind w:left="40" w:right="40" w:firstLine="0" w:firstLineChars="0"/>
               <w:rPr>
                 <w:rFonts w:ascii="Arial" w:hAnsi="Arial" w:eastAsia="Arial" w:cs="Arial"/>
                 <w:i w:val="false"/>
@@ -2993,7 +2993,7 @@
                 <w:right w:val="none" w:sz="0" w:space="0" w:color="000000"/>
               </w:pBdr>
               <w:spacing w:after="60" w:before="60" w:line="240"/>
-              <w:ind w:left="60" w:right="60" w:firstLine="0" w:firstLineChars="0"/>
+              <w:ind w:left="40" w:right="40" w:firstLine="0" w:firstLineChars="0"/>
               <w:rPr>
                 <w:rFonts w:ascii="Arial" w:hAnsi="Arial" w:eastAsia="Arial" w:cs="Arial"/>
                 <w:i w:val="false"/>
@@ -3048,7 +3048,7 @@
                 <w:right w:val="none" w:sz="0" w:space="0" w:color="000000"/>
               </w:pBdr>
               <w:spacing w:after="60" w:before="60" w:line="240"/>
-              <w:ind w:left="60" w:right="60" w:firstLine="0" w:firstLineChars="0"/>
+              <w:ind w:left="40" w:right="40" w:firstLine="0" w:firstLineChars="0"/>
               <w:rPr>
                 <w:rFonts w:ascii="Arial" w:hAnsi="Arial" w:eastAsia="Arial" w:cs="Arial"/>
                 <w:i w:val="false"/>
@@ -3103,7 +3103,7 @@
                 <w:right w:val="none" w:sz="0" w:space="0" w:color="000000"/>
               </w:pBdr>
               <w:spacing w:after="60" w:before="60" w:line="240"/>
-              <w:ind w:left="60" w:right="60" w:firstLine="0" w:firstLineChars="0"/>
+              <w:ind w:left="40" w:right="40" w:firstLine="0" w:firstLineChars="0"/>
               <w:rPr>
                 <w:rFonts w:ascii="Arial" w:hAnsi="Arial" w:eastAsia="Arial" w:cs="Arial"/>
                 <w:i w:val="false"/>
@@ -3158,7 +3158,7 @@
                 <w:right w:val="none" w:sz="0" w:space="0" w:color="000000"/>
               </w:pBdr>
               <w:spacing w:after="60" w:before="60" w:line="240"/>
-              <w:ind w:left="60" w:right="60" w:firstLine="0" w:firstLineChars="0"/>
+              <w:ind w:left="40" w:right="40" w:firstLine="0" w:firstLineChars="0"/>
               <w:rPr>
                 <w:rFonts w:ascii="Arial" w:hAnsi="Arial" w:eastAsia="Arial" w:cs="Arial"/>
                 <w:i w:val="false"/>
@@ -3213,7 +3213,7 @@
                 <w:right w:val="none" w:sz="0" w:space="0" w:color="000000"/>
               </w:pBdr>
               <w:spacing w:after="60" w:before="60" w:line="240"/>
-              <w:ind w:left="60" w:right="60" w:firstLine="0" w:firstLineChars="0"/>
+              <w:ind w:left="40" w:right="40" w:firstLine="0" w:firstLineChars="0"/>
               <w:rPr>
                 <w:rFonts w:ascii="Arial" w:hAnsi="Arial" w:eastAsia="Arial" w:cs="Arial"/>
                 <w:i w:val="false"/>
@@ -3275,7 +3275,7 @@
                 <w:right w:val="none" w:sz="0" w:space="0" w:color="000000"/>
               </w:pBdr>
               <w:spacing w:after="60" w:before="60" w:line="240"/>
-              <w:ind w:left="60" w:right="60" w:firstLine="0" w:firstLineChars="0"/>
+              <w:ind w:left="40" w:right="40" w:firstLine="0" w:firstLineChars="0"/>
               <w:rPr>
                 <w:rFonts w:ascii="Arial" w:hAnsi="Arial" w:eastAsia="Arial" w:cs="Arial"/>
                 <w:i w:val="false"/>
@@ -3336,7 +3336,7 @@
                 <w:right w:val="none" w:sz="0" w:space="0" w:color="000000"/>
               </w:pBdr>
               <w:spacing w:after="60" w:before="60" w:line="240"/>
-              <w:ind w:left="60" w:right="60" w:firstLine="0" w:firstLineChars="0"/>
+              <w:ind w:left="40" w:right="40" w:firstLine="0" w:firstLineChars="0"/>
               <w:rPr>
                 <w:rFonts w:ascii="Arial" w:hAnsi="Arial" w:eastAsia="Arial" w:cs="Arial"/>
                 <w:i w:val="false"/>
@@ -3391,7 +3391,7 @@
                 <w:right w:val="none" w:sz="0" w:space="0" w:color="000000"/>
               </w:pBdr>
               <w:spacing w:after="60" w:before="60" w:line="240"/>
-              <w:ind w:left="60" w:right="60" w:firstLine="0" w:firstLineChars="0"/>
+              <w:ind w:left="40" w:right="40" w:firstLine="0" w:firstLineChars="0"/>
               <w:rPr>
                 <w:rFonts w:ascii="Arial" w:hAnsi="Arial" w:eastAsia="Arial" w:cs="Arial"/>
                 <w:i w:val="false"/>
@@ -3446,7 +3446,7 @@
                 <w:right w:val="none" w:sz="0" w:space="0" w:color="000000"/>
               </w:pBdr>
               <w:spacing w:after="60" w:before="60" w:line="240"/>
-              <w:ind w:left="60" w:right="60" w:firstLine="0" w:firstLineChars="0"/>
+              <w:ind w:left="40" w:right="40" w:firstLine="0" w:firstLineChars="0"/>
               <w:rPr>
                 <w:rFonts w:ascii="Arial" w:hAnsi="Arial" w:eastAsia="Arial" w:cs="Arial"/>
                 <w:i w:val="false"/>
@@ -3501,7 +3501,7 @@
                 <w:right w:val="none" w:sz="0" w:space="0" w:color="000000"/>
               </w:pBdr>
               <w:spacing w:after="60" w:before="60" w:line="240"/>
-              <w:ind w:left="60" w:right="60" w:firstLine="0" w:firstLineChars="0"/>
+              <w:ind w:left="40" w:right="40" w:firstLine="0" w:firstLineChars="0"/>
               <w:rPr>
                 <w:rFonts w:ascii="Arial" w:hAnsi="Arial" w:eastAsia="Arial" w:cs="Arial"/>
                 <w:i w:val="false"/>
@@ -3556,7 +3556,7 @@
                 <w:right w:val="none" w:sz="0" w:space="0" w:color="000000"/>
               </w:pBdr>
               <w:spacing w:after="60" w:before="60" w:line="240"/>
-              <w:ind w:left="60" w:right="60" w:firstLine="0" w:firstLineChars="0"/>
+              <w:ind w:left="40" w:right="40" w:firstLine="0" w:firstLineChars="0"/>
               <w:rPr>
                 <w:rFonts w:ascii="Arial" w:hAnsi="Arial" w:eastAsia="Arial" w:cs="Arial"/>
                 <w:i w:val="false"/>
@@ -3611,7 +3611,7 @@
                 <w:right w:val="none" w:sz="0" w:space="0" w:color="000000"/>
               </w:pBdr>
               <w:spacing w:after="60" w:before="60" w:line="240"/>
-              <w:ind w:left="60" w:right="60" w:firstLine="0" w:firstLineChars="0"/>
+              <w:ind w:left="40" w:right="40" w:firstLine="0" w:firstLineChars="0"/>
               <w:rPr>
                 <w:rFonts w:ascii="Arial" w:hAnsi="Arial" w:eastAsia="Arial" w:cs="Arial"/>
                 <w:i w:val="false"/>
@@ -3672,7 +3672,7 @@
                 <w:right w:val="none" w:sz="0" w:space="0" w:color="000000"/>
               </w:pBdr>
               <w:spacing w:after="60" w:before="60" w:line="240"/>
-              <w:ind w:left="60" w:right="60" w:firstLine="0" w:firstLineChars="0"/>
+              <w:ind w:left="40" w:right="40" w:firstLine="0" w:firstLineChars="0"/>
               <w:rPr>
                 <w:rFonts w:ascii="Arial" w:hAnsi="Arial" w:eastAsia="Arial" w:cs="Arial"/>
                 <w:i w:val="false"/>
@@ -3727,7 +3727,7 @@
                 <w:right w:val="none" w:sz="0" w:space="0" w:color="000000"/>
               </w:pBdr>
               <w:spacing w:after="60" w:before="60" w:line="240"/>
-              <w:ind w:left="60" w:right="60" w:firstLine="0" w:firstLineChars="0"/>
+              <w:ind w:left="40" w:right="40" w:firstLine="0" w:firstLineChars="0"/>
               <w:rPr>
                 <w:rFonts w:ascii="Arial" w:hAnsi="Arial" w:eastAsia="Arial" w:cs="Arial"/>
                 <w:i w:val="false"/>
@@ -3782,7 +3782,7 @@
                 <w:right w:val="none" w:sz="0" w:space="0" w:color="000000"/>
               </w:pBdr>
               <w:spacing w:after="60" w:before="60" w:line="240"/>
-              <w:ind w:left="60" w:right="60" w:firstLine="0" w:firstLineChars="0"/>
+              <w:ind w:left="40" w:right="40" w:firstLine="0" w:firstLineChars="0"/>
               <w:rPr>
                 <w:rFonts w:ascii="Arial" w:hAnsi="Arial" w:eastAsia="Arial" w:cs="Arial"/>
                 <w:i w:val="false"/>
@@ -3837,7 +3837,7 @@
                 <w:right w:val="none" w:sz="0" w:space="0" w:color="000000"/>
               </w:pBdr>
               <w:spacing w:after="60" w:before="60" w:line="240"/>
-              <w:ind w:left="60" w:right="60" w:firstLine="0" w:firstLineChars="0"/>
+              <w:ind w:left="40" w:right="40" w:firstLine="0" w:firstLineChars="0"/>
               <w:rPr>
                 <w:rFonts w:ascii="Arial" w:hAnsi="Arial" w:eastAsia="Arial" w:cs="Arial"/>
                 <w:i w:val="false"/>
@@ -3892,7 +3892,7 @@
                 <w:right w:val="none" w:sz="0" w:space="0" w:color="000000"/>
               </w:pBdr>
               <w:spacing w:after="60" w:before="60" w:line="240"/>
-              <w:ind w:left="60" w:right="60" w:firstLine="0" w:firstLineChars="0"/>
+              <w:ind w:left="40" w:right="40" w:firstLine="0" w:firstLineChars="0"/>
               <w:rPr>
                 <w:rFonts w:ascii="Arial" w:hAnsi="Arial" w:eastAsia="Arial" w:cs="Arial"/>
                 <w:i w:val="false"/>
@@ -3947,7 +3947,7 @@
                 <w:right w:val="none" w:sz="0" w:space="0" w:color="000000"/>
               </w:pBdr>
               <w:spacing w:after="60" w:before="60" w:line="240"/>
-              <w:ind w:left="60" w:right="60" w:firstLine="0" w:firstLineChars="0"/>
+              <w:ind w:left="40" w:right="40" w:firstLine="0" w:firstLineChars="0"/>
               <w:rPr>
                 <w:rFonts w:ascii="Arial" w:hAnsi="Arial" w:eastAsia="Arial" w:cs="Arial"/>
                 <w:i w:val="false"/>
@@ -4009,7 +4009,7 @@
                 <w:right w:val="none" w:sz="0" w:space="0" w:color="000000"/>
               </w:pBdr>
               <w:spacing w:after="60" w:before="60" w:line="240"/>
-              <w:ind w:left="60" w:right="60" w:firstLine="0" w:firstLineChars="0"/>
+              <w:ind w:left="40" w:right="40" w:firstLine="0" w:firstLineChars="0"/>
               <w:rPr>
                 <w:rFonts w:ascii="Arial" w:hAnsi="Arial" w:eastAsia="Arial" w:cs="Arial"/>
                 <w:i w:val="false"/>
@@ -4065,7 +4065,7 @@
                 <w:right w:val="none" w:sz="0" w:space="0" w:color="000000"/>
               </w:pBdr>
               <w:spacing w:after="60" w:before="60" w:line="240"/>
-              <w:ind w:left="60" w:right="60" w:firstLine="0" w:firstLineChars="0"/>
+              <w:ind w:left="40" w:right="40" w:firstLine="0" w:firstLineChars="0"/>
               <w:rPr>
                 <w:rFonts w:ascii="Arial" w:hAnsi="Arial" w:eastAsia="Arial" w:cs="Arial"/>
                 <w:i w:val="false"/>
@@ -4121,7 +4121,7 @@
                 <w:right w:val="none" w:sz="0" w:space="0" w:color="000000"/>
               </w:pBdr>
               <w:spacing w:after="60" w:before="60" w:line="240"/>
-              <w:ind w:left="60" w:right="60" w:firstLine="0" w:firstLineChars="0"/>
+              <w:ind w:left="40" w:right="40" w:firstLine="0" w:firstLineChars="0"/>
               <w:rPr>
                 <w:rFonts w:ascii="Arial" w:hAnsi="Arial" w:eastAsia="Arial" w:cs="Arial"/>
                 <w:i w:val="false"/>
@@ -4177,7 +4177,7 @@
                 <w:right w:val="none" w:sz="0" w:space="0" w:color="000000"/>
               </w:pBdr>
               <w:spacing w:after="60" w:before="60" w:line="240"/>
-              <w:ind w:left="60" w:right="60" w:firstLine="0" w:firstLineChars="0"/>
+              <w:ind w:left="40" w:right="40" w:firstLine="0" w:firstLineChars="0"/>
               <w:rPr>
                 <w:rFonts w:ascii="Arial" w:hAnsi="Arial" w:eastAsia="Arial" w:cs="Arial"/>
                 <w:i w:val="false"/>
@@ -4233,7 +4233,7 @@
                 <w:right w:val="none" w:sz="0" w:space="0" w:color="000000"/>
               </w:pBdr>
               <w:spacing w:after="60" w:before="60" w:line="240"/>
-              <w:ind w:left="60" w:right="60" w:firstLine="0" w:firstLineChars="0"/>
+              <w:ind w:left="40" w:right="40" w:firstLine="0" w:firstLineChars="0"/>
               <w:rPr>
                 <w:rFonts w:ascii="Arial" w:hAnsi="Arial" w:eastAsia="Arial" w:cs="Arial"/>
                 <w:i w:val="false"/>
@@ -4289,7 +4289,7 @@
                 <w:right w:val="none" w:sz="0" w:space="0" w:color="000000"/>
               </w:pBdr>
               <w:spacing w:after="60" w:before="60" w:line="240"/>
-              <w:ind w:left="60" w:right="60" w:firstLine="0" w:firstLineChars="0"/>
+              <w:ind w:left="40" w:right="40" w:firstLine="0" w:firstLineChars="0"/>
               <w:rPr>
                 <w:rFonts w:ascii="Arial" w:hAnsi="Arial" w:eastAsia="Arial" w:cs="Arial"/>
                 <w:i w:val="false"/>
@@ -4351,7 +4351,7 @@
                 <w:right w:val="none" w:sz="0" w:space="0" w:color="000000"/>
               </w:pBdr>
               <w:spacing w:after="100" w:before="100" w:line="240"/>
-              <w:ind w:left="100" w:right="100" w:firstLine="0" w:firstLineChars="0"/>
+              <w:ind w:left="40" w:right="40" w:firstLine="0" w:firstLineChars="0"/>
               <w:rPr>
                 <w:rFonts w:ascii="Arial" w:hAnsi="Arial" w:eastAsia="Arial" w:cs="Arial"/>
                 <w:i w:val="false"/>

</xml_diff>

<commit_message>
Round 14a: Sonnet-only outputs, post hoc analyses, new display set and Table 4 data
WP-A round 1 and WP-T (GPT-6.1-Sol), reviewed by orchestrator. Records the
AI-risk-of-bias landscape review and author decisions on adjudication facts
and wording rules. See analysis/round14-report.md and docs/round14/REVIEW.md.

Co-Authored-By: Claude Opus 5.5 <noreply@anthropic.com>
</commit_message>
<xml_diff>
--- a/analysis/output/manuscript/Table2.docx
+++ b/analysis/output/manuscript/Table2.docx
@@ -7,7 +7,7 @@
         <w:pStyle w:val="Titre1"/>
       </w:pPr>
       <w:r>
-        <w:t xml:space="preserve">Table 2. ARBITER detected more of the risk flagged by published reviews, at lower specificity</w:t>
+        <w:t xml:space="preserve">Table 2. Before seeing any label, both adjudicators’ own ratings agreed with ARBITER far more than with the unassisted model or the published review</w:t>
       </w:r>
     </w:p>
     <w:tbl xmlns:a="http://schemas.openxmlformats.org/drawingml/2006/main" xmlns:pic="http://schemas.openxmlformats.org/drawingml/2006/picture">
@@ -17,11 +17,9 @@
         <w:tblLook w:firstRow="1" w:lastRow="0" w:firstColumn="0" w:lastColumn="0" w:noHBand="0" w:noVBand="1"/>
       </w:tblPr>
       <w:tblGrid>
-        <w:gridCol w:w="1944"/>
-        <w:gridCol w:w="1944"/>
-        <w:gridCol w:w="1944"/>
-        <w:gridCol w:w="1944"/>
-        <w:gridCol w:w="2088"/>
+        <w:gridCol w:w="4464"/>
+        <w:gridCol w:w="2376"/>
+        <w:gridCol w:w="3024"/>
       </w:tblGrid>
       <w:tr>
         <w:trPr>
@@ -81,7 +79,7 @@
                 <w:szCs w:val="18"/>
                 <w:color w:val="000000"/>
               </w:rPr>
-              <w:t xml:space="preserve">Source</w:t>
+              <w:t xml:space="preserve">Comparison</w:t>
             </w:r>
           </w:p>
         </w:tc>
@@ -193,119 +191,7 @@
                 <w:szCs w:val="18"/>
                 <w:color w:val="000000"/>
               </w:rPr>
-              <w:t xml:space="preserve">Exact agreement</w:t>
-            </w:r>
-          </w:p>
-        </w:tc>
-        <w:tc>
-          <w:tcPr>
-            <w:tcBorders>
-              <w:bottom w:val="single" w:sz="5" w:space="0" w:color="000000"/>
-              <w:top w:val="single" w:sz="8" w:space="0" w:color="000000"/>
-              <w:left w:val="none" w:sz="0" w:space="0" w:color="000000"/>
-              <w:right w:val="none" w:sz="0" w:space="0" w:color="000000"/>
-            </w:tcBorders>
-            <w:shd w:val="clear" w:color="auto" w:fill="FFFFFF"/>
-            <w:tcMar>
-              <w:top w:w="0" w:type="dxa"/>
-              <w:bottom w:w="0" w:type="dxa"/>
-              <w:left w:w="0" w:type="dxa"/>
-              <w:right w:w="0" w:type="dxa"/>
-            </w:tcMar>
-            <w:vAlign w:val="top"/>
-          </w:tcPr>
-          <w:p>
-            <w:pPr>
-              <w:pStyle w:val="Normal"/>
-              <w:jc w:val="left"/>
-              <w:keepNext/>
-              <w:pBdr>
-                <w:bottom w:val="none" w:sz="0" w:space="0" w:color="000000"/>
-                <w:top w:val="none" w:sz="0" w:space="0" w:color="000000"/>
-                <w:left w:val="none" w:sz="0" w:space="0" w:color="000000"/>
-                <w:right w:val="none" w:sz="0" w:space="0" w:color="000000"/>
-              </w:pBdr>
-              <w:spacing w:after="60" w:before="60" w:line="240"/>
-              <w:ind w:left="20" w:right="20" w:firstLine="0" w:firstLineChars="0"/>
-              <w:rPr>
-                <w:rFonts w:ascii="Arial" w:hAnsi="Arial" w:eastAsia="Arial" w:cs="Arial"/>
-                <w:i w:val="false"/>
-                <w:b w:val="true"/>
-                <w:u w:val="none"/>
-                <w:strike w:val="false"/>
-                <w:sz w:val="18"/>
-                <w:szCs w:val="18"/>
-                <w:color w:val="000000"/>
-              </w:rPr>
-            </w:pPr>
-            <w:r>
-              <w:rPr>
-                <w:rFonts w:ascii="Arial" w:hAnsi="Arial" w:eastAsia="Arial" w:cs="Arial"/>
-                <w:i w:val="false"/>
-                <w:b w:val="true"/>
-                <w:u w:val="none"/>
-                <w:strike w:val="false"/>
-                <w:sz w:val="18"/>
-                <w:szCs w:val="18"/>
-                <w:color w:val="000000"/>
-              </w:rPr>
-              <w:t xml:space="preserve">Sensitivity¹</w:t>
-            </w:r>
-          </w:p>
-        </w:tc>
-        <w:tc>
-          <w:tcPr>
-            <w:tcBorders>
-              <w:bottom w:val="single" w:sz="5" w:space="0" w:color="000000"/>
-              <w:top w:val="single" w:sz="8" w:space="0" w:color="000000"/>
-              <w:left w:val="none" w:sz="0" w:space="0" w:color="000000"/>
-              <w:right w:val="none" w:sz="0" w:space="0" w:color="000000"/>
-            </w:tcBorders>
-            <w:shd w:val="clear" w:color="auto" w:fill="FFFFFF"/>
-            <w:tcMar>
-              <w:top w:w="0" w:type="dxa"/>
-              <w:bottom w:w="0" w:type="dxa"/>
-              <w:left w:w="0" w:type="dxa"/>
-              <w:right w:w="0" w:type="dxa"/>
-            </w:tcMar>
-            <w:vAlign w:val="top"/>
-          </w:tcPr>
-          <w:p>
-            <w:pPr>
-              <w:pStyle w:val="Normal"/>
-              <w:jc w:val="left"/>
-              <w:keepNext/>
-              <w:pBdr>
-                <w:bottom w:val="none" w:sz="0" w:space="0" w:color="000000"/>
-                <w:top w:val="none" w:sz="0" w:space="0" w:color="000000"/>
-                <w:left w:val="none" w:sz="0" w:space="0" w:color="000000"/>
-                <w:right w:val="none" w:sz="0" w:space="0" w:color="000000"/>
-              </w:pBdr>
-              <w:spacing w:after="60" w:before="60" w:line="240"/>
-              <w:ind w:left="20" w:right="20" w:firstLine="0" w:firstLineChars="0"/>
-              <w:rPr>
-                <w:rFonts w:ascii="Arial" w:hAnsi="Arial" w:eastAsia="Arial" w:cs="Arial"/>
-                <w:i w:val="false"/>
-                <w:b w:val="true"/>
-                <w:u w:val="none"/>
-                <w:strike w:val="false"/>
-                <w:sz w:val="18"/>
-                <w:szCs w:val="18"/>
-                <w:color w:val="000000"/>
-              </w:rPr>
-            </w:pPr>
-            <w:r>
-              <w:rPr>
-                <w:rFonts w:ascii="Arial" w:hAnsi="Arial" w:eastAsia="Arial" w:cs="Arial"/>
-                <w:i w:val="false"/>
-                <w:b w:val="true"/>
-                <w:u w:val="none"/>
-                <w:strike w:val="false"/>
-                <w:sz w:val="18"/>
-                <w:szCs w:val="18"/>
-                <w:color w:val="000000"/>
-              </w:rPr>
-              <w:t xml:space="preserve">Specificity</w:t>
+              <w:t xml:space="preserve">Raw agreement</w:t>
             </w:r>
           </w:p>
         </w:tc>
@@ -317,7 +203,7 @@
         </w:trPr>
         <w:tc>
           <w:tcPr>
-            <w:gridSpan w:val="5"/>
+            <w:gridSpan w:val="3"/>
             <w:tcBorders>
               <w:bottom w:val="none" w:sz="0" w:space="0" w:color="000000"/>
               <w:top w:val="single" w:sz="5" w:space="0" w:color="000000"/>
@@ -367,7 +253,7 @@
                 <w:szCs w:val="18"/>
                 <w:color w:val="000000"/>
               </w:rPr>
-              <w:t xml:space="preserve">Against Published labels — D1⁠–⁠D5 (510 cells); Some concerns or High: N = 83; Low N = 427</w:t>
+              <w:t xml:space="preserve">Between adjudicators</w:t>
             </w:r>
           </w:p>
         </w:tc>
@@ -428,7 +314,7 @@
                 <w:szCs w:val="18"/>
                 <w:color w:val="000000"/>
               </w:rPr>
-              <w:t xml:space="preserve">ARBITER</w:t>
+              <w:t xml:space="preserve">Independent ratings</w:t>
             </w:r>
           </w:p>
         </w:tc>
@@ -483,7 +369,7 @@
                 <w:szCs w:val="18"/>
                 <w:color w:val="000000"/>
               </w:rPr>
-              <w:t xml:space="preserve">0.34 (0.26–0.42)</w:t>
+              <w:t xml:space="preserve">0.59 (0.48–0.68)</w:t>
             </w:r>
           </w:p>
         </w:tc>
@@ -538,117 +424,7 @@
                 <w:szCs w:val="18"/>
                 <w:color w:val="000000"/>
               </w:rPr>
-              <w:t xml:space="preserve">75.7% (72.4–79.0)</w:t>
-            </w:r>
-          </w:p>
-        </w:tc>
-        <w:tc>
-          <w:tcPr>
-            <w:tcBorders>
-              <w:bottom w:val="none" w:sz="0" w:space="0" w:color="000000"/>
-              <w:top w:val="none" w:sz="0" w:space="0" w:color="000000"/>
-              <w:left w:val="none" w:sz="0" w:space="0" w:color="000000"/>
-              <w:right w:val="none" w:sz="0" w:space="0" w:color="000000"/>
-            </w:tcBorders>
-            <w:shd w:val="clear" w:color="auto" w:fill="FFFFFF"/>
-            <w:tcMar>
-              <w:top w:w="0" w:type="dxa"/>
-              <w:bottom w:w="0" w:type="dxa"/>
-              <w:left w:w="0" w:type="dxa"/>
-              <w:right w:w="0" w:type="dxa"/>
-            </w:tcMar>
-            <w:vAlign w:val="top"/>
-          </w:tcPr>
-          <w:p>
-            <w:pPr>
-              <w:pStyle w:val="Normal"/>
-              <w:jc w:val="left"/>
-              <w:pBdr>
-                <w:bottom w:val="none" w:sz="0" w:space="0" w:color="000000"/>
-                <w:top w:val="none" w:sz="0" w:space="0" w:color="000000"/>
-                <w:left w:val="none" w:sz="0" w:space="0" w:color="000000"/>
-                <w:right w:val="none" w:sz="0" w:space="0" w:color="000000"/>
-              </w:pBdr>
-              <w:spacing w:after="60" w:before="60" w:line="240"/>
-              <w:ind w:left="20" w:right="20" w:firstLine="0" w:firstLineChars="0"/>
-              <w:rPr>
-                <w:rFonts w:ascii="Arial" w:hAnsi="Arial" w:eastAsia="Arial" w:cs="Arial"/>
-                <w:i w:val="false"/>
-                <w:b w:val="false"/>
-                <w:u w:val="none"/>
-                <w:strike w:val="false"/>
-                <w:sz w:val="18"/>
-                <w:szCs w:val="18"/>
-                <w:color w:val="000000"/>
-              </w:rPr>
-            </w:pPr>
-            <w:r>
-              <w:rPr>
-                <w:rFonts w:ascii="Arial" w:hAnsi="Arial" w:eastAsia="Arial" w:cs="Arial"/>
-                <w:i w:val="false"/>
-                <w:b w:val="false"/>
-                <w:u w:val="none"/>
-                <w:strike w:val="false"/>
-                <w:sz w:val="18"/>
-                <w:szCs w:val="18"/>
-                <w:color w:val="000000"/>
-              </w:rPr>
-              <w:t xml:space="preserve">66.3% (57.3–74.7)</w:t>
-            </w:r>
-          </w:p>
-        </w:tc>
-        <w:tc>
-          <w:tcPr>
-            <w:tcBorders>
-              <w:bottom w:val="none" w:sz="0" w:space="0" w:color="000000"/>
-              <w:top w:val="none" w:sz="0" w:space="0" w:color="000000"/>
-              <w:left w:val="none" w:sz="0" w:space="0" w:color="000000"/>
-              <w:right w:val="none" w:sz="0" w:space="0" w:color="000000"/>
-            </w:tcBorders>
-            <w:shd w:val="clear" w:color="auto" w:fill="FFFFFF"/>
-            <w:tcMar>
-              <w:top w:w="0" w:type="dxa"/>
-              <w:bottom w:w="0" w:type="dxa"/>
-              <w:left w:w="0" w:type="dxa"/>
-              <w:right w:w="0" w:type="dxa"/>
-            </w:tcMar>
-            <w:vAlign w:val="top"/>
-          </w:tcPr>
-          <w:p>
-            <w:pPr>
-              <w:pStyle w:val="Normal"/>
-              <w:jc w:val="left"/>
-              <w:pBdr>
-                <w:bottom w:val="none" w:sz="0" w:space="0" w:color="000000"/>
-                <w:top w:val="none" w:sz="0" w:space="0" w:color="000000"/>
-                <w:left w:val="none" w:sz="0" w:space="0" w:color="000000"/>
-                <w:right w:val="none" w:sz="0" w:space="0" w:color="000000"/>
-              </w:pBdr>
-              <w:spacing w:after="60" w:before="60" w:line="240"/>
-              <w:ind w:left="20" w:right="20" w:firstLine="0" w:firstLineChars="0"/>
-              <w:rPr>
-                <w:rFonts w:ascii="Arial" w:hAnsi="Arial" w:eastAsia="Arial" w:cs="Arial"/>
-                <w:i w:val="false"/>
-                <w:b w:val="false"/>
-                <w:u w:val="none"/>
-                <w:strike w:val="false"/>
-                <w:sz w:val="18"/>
-                <w:szCs w:val="18"/>
-                <w:color w:val="000000"/>
-              </w:rPr>
-            </w:pPr>
-            <w:r>
-              <w:rPr>
-                <w:rFonts w:ascii="Arial" w:hAnsi="Arial" w:eastAsia="Arial" w:cs="Arial"/>
-                <w:i w:val="false"/>
-                <w:b w:val="false"/>
-                <w:u w:val="none"/>
-                <w:strike w:val="false"/>
-                <w:sz w:val="18"/>
-                <w:szCs w:val="18"/>
-                <w:color w:val="000000"/>
-              </w:rPr>
-              <w:t xml:space="preserve">81.3% (77.7–84.7)</w:t>
+              <w:t xml:space="preserve">114/154 (74.0%; 68.2–79.9)</w:t>
             </w:r>
           </w:p>
         </w:tc>
@@ -709,7 +485,7 @@
                 <w:szCs w:val="18"/>
                 <w:color w:val="000000"/>
               </w:rPr>
-              <w:t xml:space="preserve">Unassisted</w:t>
+              <w:t xml:space="preserve">Ratings chosen after seeing labels</w:t>
             </w:r>
           </w:p>
         </w:tc>
@@ -764,7 +540,7 @@
                 <w:szCs w:val="18"/>
                 <w:color w:val="000000"/>
               </w:rPr>
-              <w:t xml:space="preserve">0.28 (0.21–0.35)</w:t>
+              <w:t xml:space="preserve">0.69 (0.57–0.79)</w:t>
             </w:r>
           </w:p>
         </w:tc>
@@ -819,12 +595,19 @@
                 <w:szCs w:val="18"/>
                 <w:color w:val="000000"/>
               </w:rPr>
-              <w:t xml:space="preserve">77.5% (74.1–80.8)</w:t>
+              <w:t xml:space="preserve">129/154 (83.8%; 78.6–88.9)</w:t>
             </w:r>
           </w:p>
         </w:tc>
+      </w:tr>
+      <w:tr>
+        <w:trPr>
+          <w:cantSplit/>
+          <w:trHeight w:val="480" w:hRule="auto"/>
+        </w:trPr>
         <w:tc>
           <w:tcPr>
+            <w:gridSpan w:val="3"/>
             <w:tcBorders>
               <w:bottom w:val="none" w:sz="0" w:space="0" w:color="000000"/>
               <w:top w:val="none" w:sz="0" w:space="0" w:color="000000"/>
@@ -855,7 +638,7 @@
               <w:rPr>
                 <w:rFonts w:ascii="Arial" w:hAnsi="Arial" w:eastAsia="Arial" w:cs="Arial"/>
                 <w:i w:val="false"/>
-                <w:b w:val="false"/>
+                <w:b w:val="true"/>
                 <w:u w:val="none"/>
                 <w:strike w:val="false"/>
                 <w:sz w:val="18"/>
@@ -867,69 +650,14 @@
               <w:rPr>
                 <w:rFonts w:ascii="Arial" w:hAnsi="Arial" w:eastAsia="Arial" w:cs="Arial"/>
                 <w:i w:val="false"/>
-                <w:b w:val="false"/>
-                <w:u w:val="none"/>
-                <w:strike w:val="false"/>
-                <w:sz w:val="18"/>
-                <w:szCs w:val="18"/>
-                <w:color w:val="000000"/>
-              </w:rPr>
-              <w:t xml:space="preserve">50.6% (40.3–60.2)</w:t>
-            </w:r>
-          </w:p>
-        </w:tc>
-        <w:tc>
-          <w:tcPr>
-            <w:tcBorders>
-              <w:bottom w:val="none" w:sz="0" w:space="0" w:color="000000"/>
-              <w:top w:val="none" w:sz="0" w:space="0" w:color="000000"/>
-              <w:left w:val="none" w:sz="0" w:space="0" w:color="000000"/>
-              <w:right w:val="none" w:sz="0" w:space="0" w:color="000000"/>
-            </w:tcBorders>
-            <w:shd w:val="clear" w:color="auto" w:fill="FFFFFF"/>
-            <w:tcMar>
-              <w:top w:w="0" w:type="dxa"/>
-              <w:bottom w:w="0" w:type="dxa"/>
-              <w:left w:w="0" w:type="dxa"/>
-              <w:right w:w="0" w:type="dxa"/>
-            </w:tcMar>
-            <w:vAlign w:val="top"/>
-          </w:tcPr>
-          <w:p>
-            <w:pPr>
-              <w:pStyle w:val="Normal"/>
-              <w:jc w:val="left"/>
-              <w:pBdr>
-                <w:bottom w:val="none" w:sz="0" w:space="0" w:color="000000"/>
-                <w:top w:val="none" w:sz="0" w:space="0" w:color="000000"/>
-                <w:left w:val="none" w:sz="0" w:space="0" w:color="000000"/>
-                <w:right w:val="none" w:sz="0" w:space="0" w:color="000000"/>
-              </w:pBdr>
-              <w:spacing w:after="60" w:before="60" w:line="240"/>
-              <w:ind w:left="20" w:right="20" w:firstLine="0" w:firstLineChars="0"/>
-              <w:rPr>
-                <w:rFonts w:ascii="Arial" w:hAnsi="Arial" w:eastAsia="Arial" w:cs="Arial"/>
-                <w:i w:val="false"/>
-                <w:b w:val="false"/>
-                <w:u w:val="none"/>
-                <w:strike w:val="false"/>
-                <w:sz w:val="18"/>
-                <w:szCs w:val="18"/>
-                <w:color w:val="000000"/>
-              </w:rPr>
-            </w:pPr>
-            <w:r>
-              <w:rPr>
-                <w:rFonts w:ascii="Arial" w:hAnsi="Arial" w:eastAsia="Arial" w:cs="Arial"/>
-                <w:i w:val="false"/>
-                <w:b w:val="false"/>
-                <w:u w:val="none"/>
-                <w:strike w:val="false"/>
-                <w:sz w:val="18"/>
-                <w:szCs w:val="18"/>
-                <w:color w:val="000000"/>
-              </w:rPr>
-              <w:t xml:space="preserve">85.7% (82.1–89.3)</w:t>
+                <w:b w:val="true"/>
+                <w:u w:val="none"/>
+                <w:strike w:val="false"/>
+                <w:sz w:val="18"/>
+                <w:szCs w:val="18"/>
+                <w:color w:val="000000"/>
+              </w:rPr>
+              <w:t xml:space="preserve">Adjudicator 1 own rating compared with …</w:t>
             </w:r>
           </w:p>
         </w:tc>
@@ -990,7 +718,7 @@
                 <w:szCs w:val="18"/>
                 <w:color w:val="000000"/>
               </w:rPr>
-              <w:t xml:space="preserve">All-Low rule</w:t>
+              <w:t xml:space="preserve">Published</w:t>
             </w:r>
           </w:p>
         </w:tc>
@@ -1045,7 +773,7 @@
                 <w:szCs w:val="18"/>
                 <w:color w:val="000000"/>
               </w:rPr>
-              <w:t xml:space="preserve">—</w:t>
+              <w:t xml:space="preserve">−0.08 (−0.17 to 0.01)</w:t>
             </w:r>
           </w:p>
         </w:tc>
@@ -1100,179 +828,7 @@
                 <w:szCs w:val="18"/>
                 <w:color w:val="000000"/>
               </w:rPr>
-              <w:t xml:space="preserve">83.7% (81.0–86.5)</w:t>
-            </w:r>
-          </w:p>
-        </w:tc>
-        <w:tc>
-          <w:tcPr>
-            <w:tcBorders>
-              <w:bottom w:val="none" w:sz="0" w:space="0" w:color="000000"/>
-              <w:top w:val="none" w:sz="0" w:space="0" w:color="000000"/>
-              <w:left w:val="none" w:sz="0" w:space="0" w:color="000000"/>
-              <w:right w:val="none" w:sz="0" w:space="0" w:color="000000"/>
-            </w:tcBorders>
-            <w:shd w:val="clear" w:color="auto" w:fill="FFFFFF"/>
-            <w:tcMar>
-              <w:top w:w="0" w:type="dxa"/>
-              <w:bottom w:w="0" w:type="dxa"/>
-              <w:left w:w="0" w:type="dxa"/>
-              <w:right w:w="0" w:type="dxa"/>
-            </w:tcMar>
-            <w:vAlign w:val="top"/>
-          </w:tcPr>
-          <w:p>
-            <w:pPr>
-              <w:pStyle w:val="Normal"/>
-              <w:jc w:val="left"/>
-              <w:pBdr>
-                <w:bottom w:val="none" w:sz="0" w:space="0" w:color="000000"/>
-                <w:top w:val="none" w:sz="0" w:space="0" w:color="000000"/>
-                <w:left w:val="none" w:sz="0" w:space="0" w:color="000000"/>
-                <w:right w:val="none" w:sz="0" w:space="0" w:color="000000"/>
-              </w:pBdr>
-              <w:spacing w:after="60" w:before="60" w:line="240"/>
-              <w:ind w:left="20" w:right="20" w:firstLine="0" w:firstLineChars="0"/>
-              <w:rPr>
-                <w:rFonts w:ascii="Arial" w:hAnsi="Arial" w:eastAsia="Arial" w:cs="Arial"/>
-                <w:i w:val="false"/>
-                <w:b w:val="false"/>
-                <w:u w:val="none"/>
-                <w:strike w:val="false"/>
-                <w:sz w:val="18"/>
-                <w:szCs w:val="18"/>
-                <w:color w:val="000000"/>
-              </w:rPr>
-            </w:pPr>
-            <w:r>
-              <w:rPr>
-                <w:rFonts w:ascii="Arial" w:hAnsi="Arial" w:eastAsia="Arial" w:cs="Arial"/>
-                <w:i w:val="false"/>
-                <w:b w:val="false"/>
-                <w:u w:val="none"/>
-                <w:strike w:val="false"/>
-                <w:sz w:val="18"/>
-                <w:szCs w:val="18"/>
-                <w:color w:val="000000"/>
-              </w:rPr>
-              <w:t xml:space="preserve">—</w:t>
-            </w:r>
-          </w:p>
-        </w:tc>
-        <w:tc>
-          <w:tcPr>
-            <w:tcBorders>
-              <w:bottom w:val="none" w:sz="0" w:space="0" w:color="000000"/>
-              <w:top w:val="none" w:sz="0" w:space="0" w:color="000000"/>
-              <w:left w:val="none" w:sz="0" w:space="0" w:color="000000"/>
-              <w:right w:val="none" w:sz="0" w:space="0" w:color="000000"/>
-            </w:tcBorders>
-            <w:shd w:val="clear" w:color="auto" w:fill="FFFFFF"/>
-            <w:tcMar>
-              <w:top w:w="0" w:type="dxa"/>
-              <w:bottom w:w="0" w:type="dxa"/>
-              <w:left w:w="0" w:type="dxa"/>
-              <w:right w:w="0" w:type="dxa"/>
-            </w:tcMar>
-            <w:vAlign w:val="top"/>
-          </w:tcPr>
-          <w:p>
-            <w:pPr>
-              <w:pStyle w:val="Normal"/>
-              <w:jc w:val="left"/>
-              <w:pBdr>
-                <w:bottom w:val="none" w:sz="0" w:space="0" w:color="000000"/>
-                <w:top w:val="none" w:sz="0" w:space="0" w:color="000000"/>
-                <w:left w:val="none" w:sz="0" w:space="0" w:color="000000"/>
-                <w:right w:val="none" w:sz="0" w:space="0" w:color="000000"/>
-              </w:pBdr>
-              <w:spacing w:after="60" w:before="60" w:line="240"/>
-              <w:ind w:left="20" w:right="20" w:firstLine="0" w:firstLineChars="0"/>
-              <w:rPr>
-                <w:rFonts w:ascii="Arial" w:hAnsi="Arial" w:eastAsia="Arial" w:cs="Arial"/>
-                <w:i w:val="false"/>
-                <w:b w:val="false"/>
-                <w:u w:val="none"/>
-                <w:strike w:val="false"/>
-                <w:sz w:val="18"/>
-                <w:szCs w:val="18"/>
-                <w:color w:val="000000"/>
-              </w:rPr>
-            </w:pPr>
-            <w:r>
-              <w:rPr>
-                <w:rFonts w:ascii="Arial" w:hAnsi="Arial" w:eastAsia="Arial" w:cs="Arial"/>
-                <w:i w:val="false"/>
-                <w:b w:val="false"/>
-                <w:u w:val="none"/>
-                <w:strike w:val="false"/>
-                <w:sz w:val="18"/>
-                <w:szCs w:val="18"/>
-                <w:color w:val="000000"/>
-              </w:rPr>
-              <w:t xml:space="preserve">100.0%</w:t>
-            </w:r>
-          </w:p>
-        </w:tc>
-      </w:tr>
-      <w:tr>
-        <w:trPr>
-          <w:cantSplit/>
-          <w:trHeight w:val="480" w:hRule="auto"/>
-        </w:trPr>
-        <w:tc>
-          <w:tcPr>
-            <w:gridSpan w:val="5"/>
-            <w:tcBorders>
-              <w:bottom w:val="none" w:sz="0" w:space="0" w:color="000000"/>
-              <w:top w:val="none" w:sz="0" w:space="0" w:color="000000"/>
-              <w:left w:val="none" w:sz="0" w:space="0" w:color="000000"/>
-              <w:right w:val="none" w:sz="0" w:space="0" w:color="000000"/>
-            </w:tcBorders>
-            <w:shd w:val="clear" w:color="auto" w:fill="FFFFFF"/>
-            <w:tcMar>
-              <w:top w:w="0" w:type="dxa"/>
-              <w:bottom w:w="0" w:type="dxa"/>
-              <w:left w:w="0" w:type="dxa"/>
-              <w:right w:w="0" w:type="dxa"/>
-            </w:tcMar>
-            <w:vAlign w:val="top"/>
-          </w:tcPr>
-          <w:p>
-            <w:pPr>
-              <w:pStyle w:val="Normal"/>
-              <w:jc w:val="left"/>
-              <w:pBdr>
-                <w:bottom w:val="none" w:sz="0" w:space="0" w:color="000000"/>
-                <w:top w:val="none" w:sz="0" w:space="0" w:color="000000"/>
-                <w:left w:val="none" w:sz="0" w:space="0" w:color="000000"/>
-                <w:right w:val="none" w:sz="0" w:space="0" w:color="000000"/>
-              </w:pBdr>
-              <w:spacing w:after="60" w:before="60" w:line="240"/>
-              <w:ind w:left="20" w:right="20" w:firstLine="0" w:firstLineChars="0"/>
-              <w:rPr>
-                <w:rFonts w:ascii="Arial" w:hAnsi="Arial" w:eastAsia="Arial" w:cs="Arial"/>
-                <w:i w:val="false"/>
-                <w:b w:val="true"/>
-                <w:u w:val="none"/>
-                <w:strike w:val="false"/>
-                <w:sz w:val="18"/>
-                <w:szCs w:val="18"/>
-                <w:color w:val="000000"/>
-              </w:rPr>
-            </w:pPr>
-            <w:r>
-              <w:rPr>
-                <w:rFonts w:ascii="Arial" w:hAnsi="Arial" w:eastAsia="Arial" w:cs="Arial"/>
-                <w:i w:val="false"/>
-                <w:b w:val="true"/>
-                <w:u w:val="none"/>
-                <w:strike w:val="false"/>
-                <w:sz w:val="18"/>
-                <w:szCs w:val="18"/>
-                <w:color w:val="000000"/>
-              </w:rPr>
-              <w:t xml:space="preserve">Against Published labels — Overall (81 trials); Some concerns or High: N = 39; Low N = 42</w:t>
+              <w:t xml:space="preserve">34/154 (22.1%; 15.8–28.5)</w:t>
             </w:r>
           </w:p>
         </w:tc>
@@ -1388,7 +944,7 @@
                 <w:szCs w:val="18"/>
                 <w:color w:val="000000"/>
               </w:rPr>
-              <w:t xml:space="preserve">0.44 (0.32–0.56)</w:t>
+              <w:t xml:space="preserve">0.52 (0.41–0.62)</w:t>
             </w:r>
           </w:p>
         </w:tc>
@@ -1443,117 +999,7 @@
                 <w:szCs w:val="18"/>
                 <w:color w:val="000000"/>
               </w:rPr>
-              <w:t xml:space="preserve">58.0% (49.4–66.7)</w:t>
-            </w:r>
-          </w:p>
-        </w:tc>
-        <w:tc>
-          <w:tcPr>
-            <w:tcBorders>
-              <w:bottom w:val="none" w:sz="0" w:space="0" w:color="000000"/>
-              <w:top w:val="none" w:sz="0" w:space="0" w:color="000000"/>
-              <w:left w:val="none" w:sz="0" w:space="0" w:color="000000"/>
-              <w:right w:val="none" w:sz="0" w:space="0" w:color="000000"/>
-            </w:tcBorders>
-            <w:shd w:val="clear" w:color="auto" w:fill="FFFFFF"/>
-            <w:tcMar>
-              <w:top w:w="0" w:type="dxa"/>
-              <w:bottom w:w="0" w:type="dxa"/>
-              <w:left w:w="0" w:type="dxa"/>
-              <w:right w:w="0" w:type="dxa"/>
-            </w:tcMar>
-            <w:vAlign w:val="top"/>
-          </w:tcPr>
-          <w:p>
-            <w:pPr>
-              <w:pStyle w:val="Normal"/>
-              <w:jc w:val="left"/>
-              <w:pBdr>
-                <w:bottom w:val="none" w:sz="0" w:space="0" w:color="000000"/>
-                <w:top w:val="none" w:sz="0" w:space="0" w:color="000000"/>
-                <w:left w:val="none" w:sz="0" w:space="0" w:color="000000"/>
-                <w:right w:val="none" w:sz="0" w:space="0" w:color="000000"/>
-              </w:pBdr>
-              <w:spacing w:after="60" w:before="60" w:line="240"/>
-              <w:ind w:left="20" w:right="20" w:firstLine="0" w:firstLineChars="0"/>
-              <w:rPr>
-                <w:rFonts w:ascii="Arial" w:hAnsi="Arial" w:eastAsia="Arial" w:cs="Arial"/>
-                <w:i w:val="false"/>
-                <w:b w:val="false"/>
-                <w:u w:val="none"/>
-                <w:strike w:val="false"/>
-                <w:sz w:val="18"/>
-                <w:szCs w:val="18"/>
-                <w:color w:val="000000"/>
-              </w:rPr>
-            </w:pPr>
-            <w:r>
-              <w:rPr>
-                <w:rFonts w:ascii="Arial" w:hAnsi="Arial" w:eastAsia="Arial" w:cs="Arial"/>
-                <w:i w:val="false"/>
-                <w:b w:val="false"/>
-                <w:u w:val="none"/>
-                <w:strike w:val="false"/>
-                <w:sz w:val="18"/>
-                <w:szCs w:val="18"/>
-                <w:color w:val="000000"/>
-              </w:rPr>
-              <w:t xml:space="preserve">92.3% (83.7–100.0)</w:t>
-            </w:r>
-          </w:p>
-        </w:tc>
-        <w:tc>
-          <w:tcPr>
-            <w:tcBorders>
-              <w:bottom w:val="none" w:sz="0" w:space="0" w:color="000000"/>
-              <w:top w:val="none" w:sz="0" w:space="0" w:color="000000"/>
-              <w:left w:val="none" w:sz="0" w:space="0" w:color="000000"/>
-              <w:right w:val="none" w:sz="0" w:space="0" w:color="000000"/>
-            </w:tcBorders>
-            <w:shd w:val="clear" w:color="auto" w:fill="FFFFFF"/>
-            <w:tcMar>
-              <w:top w:w="0" w:type="dxa"/>
-              <w:bottom w:w="0" w:type="dxa"/>
-              <w:left w:w="0" w:type="dxa"/>
-              <w:right w:w="0" w:type="dxa"/>
-            </w:tcMar>
-            <w:vAlign w:val="top"/>
-          </w:tcPr>
-          <w:p>
-            <w:pPr>
-              <w:pStyle w:val="Normal"/>
-              <w:jc w:val="left"/>
-              <w:pBdr>
-                <w:bottom w:val="none" w:sz="0" w:space="0" w:color="000000"/>
-                <w:top w:val="none" w:sz="0" w:space="0" w:color="000000"/>
-                <w:left w:val="none" w:sz="0" w:space="0" w:color="000000"/>
-                <w:right w:val="none" w:sz="0" w:space="0" w:color="000000"/>
-              </w:pBdr>
-              <w:spacing w:after="60" w:before="60" w:line="240"/>
-              <w:ind w:left="20" w:right="20" w:firstLine="0" w:firstLineChars="0"/>
-              <w:rPr>
-                <w:rFonts w:ascii="Arial" w:hAnsi="Arial" w:eastAsia="Arial" w:cs="Arial"/>
-                <w:i w:val="false"/>
-                <w:b w:val="false"/>
-                <w:u w:val="none"/>
-                <w:strike w:val="false"/>
-                <w:sz w:val="18"/>
-                <w:szCs w:val="18"/>
-                <w:color w:val="000000"/>
-              </w:rPr>
-            </w:pPr>
-            <w:r>
-              <w:rPr>
-                <w:rFonts w:ascii="Arial" w:hAnsi="Arial" w:eastAsia="Arial" w:cs="Arial"/>
-                <w:i w:val="false"/>
-                <w:b w:val="false"/>
-                <w:u w:val="none"/>
-                <w:strike w:val="false"/>
-                <w:sz w:val="18"/>
-                <w:szCs w:val="18"/>
-                <w:color w:val="000000"/>
-              </w:rPr>
-              <w:t xml:space="preserve">54.8% (44.2–67.4)</w:t>
+              <w:t xml:space="preserve">107/154 (69.5%; 62.7–76.0)</w:t>
             </w:r>
           </w:p>
         </w:tc>
@@ -1669,7 +1115,7 @@
                 <w:szCs w:val="18"/>
                 <w:color w:val="000000"/>
               </w:rPr>
-              <w:t xml:space="preserve">0.42 (0.27–0.56)</w:t>
+              <w:t xml:space="preserve">0.22 (0.13–0.30)</w:t>
             </w:r>
           </w:p>
         </w:tc>
@@ -1724,12 +1170,19 @@
                 <w:szCs w:val="18"/>
                 <w:color w:val="000000"/>
               </w:rPr>
-              <w:t xml:space="preserve">59.3% (50.6–67.9)</w:t>
+              <w:t xml:space="preserve">69/154 (44.8%; 38.1–51.6)</w:t>
             </w:r>
           </w:p>
         </w:tc>
+      </w:tr>
+      <w:tr>
+        <w:trPr>
+          <w:cantSplit/>
+          <w:trHeight w:val="480" w:hRule="auto"/>
+        </w:trPr>
         <w:tc>
           <w:tcPr>
+            <w:gridSpan w:val="3"/>
             <w:tcBorders>
               <w:bottom w:val="none" w:sz="0" w:space="0" w:color="000000"/>
               <w:top w:val="none" w:sz="0" w:space="0" w:color="000000"/>
@@ -1760,7 +1213,7 @@
               <w:rPr>
                 <w:rFonts w:ascii="Arial" w:hAnsi="Arial" w:eastAsia="Arial" w:cs="Arial"/>
                 <w:i w:val="false"/>
-                <w:b w:val="false"/>
+                <w:b w:val="true"/>
                 <w:u w:val="none"/>
                 <w:strike w:val="false"/>
                 <w:sz w:val="18"/>
@@ -1772,69 +1225,14 @@
               <w:rPr>
                 <w:rFonts w:ascii="Arial" w:hAnsi="Arial" w:eastAsia="Arial" w:cs="Arial"/>
                 <w:i w:val="false"/>
-                <w:b w:val="false"/>
-                <w:u w:val="none"/>
-                <w:strike w:val="false"/>
-                <w:sz w:val="18"/>
-                <w:szCs w:val="18"/>
-                <w:color w:val="000000"/>
-              </w:rPr>
-              <w:t xml:space="preserve">64.1% (50.0–77.8)</w:t>
-            </w:r>
-          </w:p>
-        </w:tc>
-        <w:tc>
-          <w:tcPr>
-            <w:tcBorders>
-              <w:bottom w:val="none" w:sz="0" w:space="0" w:color="000000"/>
-              <w:top w:val="none" w:sz="0" w:space="0" w:color="000000"/>
-              <w:left w:val="none" w:sz="0" w:space="0" w:color="000000"/>
-              <w:right w:val="none" w:sz="0" w:space="0" w:color="000000"/>
-            </w:tcBorders>
-            <w:shd w:val="clear" w:color="auto" w:fill="FFFFFF"/>
-            <w:tcMar>
-              <w:top w:w="0" w:type="dxa"/>
-              <w:bottom w:w="0" w:type="dxa"/>
-              <w:left w:w="0" w:type="dxa"/>
-              <w:right w:w="0" w:type="dxa"/>
-            </w:tcMar>
-            <w:vAlign w:val="top"/>
-          </w:tcPr>
-          <w:p>
-            <w:pPr>
-              <w:pStyle w:val="Normal"/>
-              <w:jc w:val="left"/>
-              <w:pBdr>
-                <w:bottom w:val="none" w:sz="0" w:space="0" w:color="000000"/>
-                <w:top w:val="none" w:sz="0" w:space="0" w:color="000000"/>
-                <w:left w:val="none" w:sz="0" w:space="0" w:color="000000"/>
-                <w:right w:val="none" w:sz="0" w:space="0" w:color="000000"/>
-              </w:pBdr>
-              <w:spacing w:after="60" w:before="60" w:line="240"/>
-              <w:ind w:left="20" w:right="20" w:firstLine="0" w:firstLineChars="0"/>
-              <w:rPr>
-                <w:rFonts w:ascii="Arial" w:hAnsi="Arial" w:eastAsia="Arial" w:cs="Arial"/>
-                <w:i w:val="false"/>
-                <w:b w:val="false"/>
-                <w:u w:val="none"/>
-                <w:strike w:val="false"/>
-                <w:sz w:val="18"/>
-                <w:szCs w:val="18"/>
-                <w:color w:val="000000"/>
-              </w:rPr>
-            </w:pPr>
-            <w:r>
-              <w:rPr>
-                <w:rFonts w:ascii="Arial" w:hAnsi="Arial" w:eastAsia="Arial" w:cs="Arial"/>
-                <w:i w:val="false"/>
-                <w:b w:val="false"/>
-                <w:u w:val="none"/>
-                <w:strike w:val="false"/>
-                <w:sz w:val="18"/>
-                <w:szCs w:val="18"/>
-                <w:color w:val="000000"/>
-              </w:rPr>
-              <w:t xml:space="preserve">76.2% (65.9–86.8)</w:t>
+                <w:b w:val="true"/>
+                <w:u w:val="none"/>
+                <w:strike w:val="false"/>
+                <w:sz w:val="18"/>
+                <w:szCs w:val="18"/>
+                <w:color w:val="000000"/>
+              </w:rPr>
+              <w:t xml:space="preserve">Adjudicator 2 own rating compared with …</w:t>
             </w:r>
           </w:p>
         </w:tc>
@@ -1895,7 +1293,7 @@
                 <w:szCs w:val="18"/>
                 <w:color w:val="000000"/>
               </w:rPr>
-              <w:t xml:space="preserve">All-Low rule</w:t>
+              <w:t xml:space="preserve">Published</w:t>
             </w:r>
           </w:p>
         </w:tc>
@@ -1950,7 +1348,7 @@
                 <w:szCs w:val="18"/>
                 <w:color w:val="000000"/>
               </w:rPr>
-              <w:t xml:space="preserve">—</w:t>
+              <w:t xml:space="preserve">−0.08 (−0.18 to 0.03)</w:t>
             </w:r>
           </w:p>
         </w:tc>
@@ -2005,179 +1403,7 @@
                 <w:szCs w:val="18"/>
                 <w:color w:val="000000"/>
               </w:rPr>
-              <w:t xml:space="preserve">51.9% (44.4–59.3)</w:t>
-            </w:r>
-          </w:p>
-        </w:tc>
-        <w:tc>
-          <w:tcPr>
-            <w:tcBorders>
-              <w:bottom w:val="none" w:sz="0" w:space="0" w:color="000000"/>
-              <w:top w:val="none" w:sz="0" w:space="0" w:color="000000"/>
-              <w:left w:val="none" w:sz="0" w:space="0" w:color="000000"/>
-              <w:right w:val="none" w:sz="0" w:space="0" w:color="000000"/>
-            </w:tcBorders>
-            <w:shd w:val="clear" w:color="auto" w:fill="FFFFFF"/>
-            <w:tcMar>
-              <w:top w:w="0" w:type="dxa"/>
-              <w:bottom w:w="0" w:type="dxa"/>
-              <w:left w:w="0" w:type="dxa"/>
-              <w:right w:w="0" w:type="dxa"/>
-            </w:tcMar>
-            <w:vAlign w:val="top"/>
-          </w:tcPr>
-          <w:p>
-            <w:pPr>
-              <w:pStyle w:val="Normal"/>
-              <w:jc w:val="left"/>
-              <w:pBdr>
-                <w:bottom w:val="none" w:sz="0" w:space="0" w:color="000000"/>
-                <w:top w:val="none" w:sz="0" w:space="0" w:color="000000"/>
-                <w:left w:val="none" w:sz="0" w:space="0" w:color="000000"/>
-                <w:right w:val="none" w:sz="0" w:space="0" w:color="000000"/>
-              </w:pBdr>
-              <w:spacing w:after="60" w:before="60" w:line="240"/>
-              <w:ind w:left="20" w:right="20" w:firstLine="0" w:firstLineChars="0"/>
-              <w:rPr>
-                <w:rFonts w:ascii="Arial" w:hAnsi="Arial" w:eastAsia="Arial" w:cs="Arial"/>
-                <w:i w:val="false"/>
-                <w:b w:val="false"/>
-                <w:u w:val="none"/>
-                <w:strike w:val="false"/>
-                <w:sz w:val="18"/>
-                <w:szCs w:val="18"/>
-                <w:color w:val="000000"/>
-              </w:rPr>
-            </w:pPr>
-            <w:r>
-              <w:rPr>
-                <w:rFonts w:ascii="Arial" w:hAnsi="Arial" w:eastAsia="Arial" w:cs="Arial"/>
-                <w:i w:val="false"/>
-                <w:b w:val="false"/>
-                <w:u w:val="none"/>
-                <w:strike w:val="false"/>
-                <w:sz w:val="18"/>
-                <w:szCs w:val="18"/>
-                <w:color w:val="000000"/>
-              </w:rPr>
-              <w:t xml:space="preserve">—</w:t>
-            </w:r>
-          </w:p>
-        </w:tc>
-        <w:tc>
-          <w:tcPr>
-            <w:tcBorders>
-              <w:bottom w:val="none" w:sz="0" w:space="0" w:color="000000"/>
-              <w:top w:val="none" w:sz="0" w:space="0" w:color="000000"/>
-              <w:left w:val="none" w:sz="0" w:space="0" w:color="000000"/>
-              <w:right w:val="none" w:sz="0" w:space="0" w:color="000000"/>
-            </w:tcBorders>
-            <w:shd w:val="clear" w:color="auto" w:fill="FFFFFF"/>
-            <w:tcMar>
-              <w:top w:w="0" w:type="dxa"/>
-              <w:bottom w:w="0" w:type="dxa"/>
-              <w:left w:w="0" w:type="dxa"/>
-              <w:right w:w="0" w:type="dxa"/>
-            </w:tcMar>
-            <w:vAlign w:val="top"/>
-          </w:tcPr>
-          <w:p>
-            <w:pPr>
-              <w:pStyle w:val="Normal"/>
-              <w:jc w:val="left"/>
-              <w:pBdr>
-                <w:bottom w:val="none" w:sz="0" w:space="0" w:color="000000"/>
-                <w:top w:val="none" w:sz="0" w:space="0" w:color="000000"/>
-                <w:left w:val="none" w:sz="0" w:space="0" w:color="000000"/>
-                <w:right w:val="none" w:sz="0" w:space="0" w:color="000000"/>
-              </w:pBdr>
-              <w:spacing w:after="60" w:before="60" w:line="240"/>
-              <w:ind w:left="20" w:right="20" w:firstLine="0" w:firstLineChars="0"/>
-              <w:rPr>
-                <w:rFonts w:ascii="Arial" w:hAnsi="Arial" w:eastAsia="Arial" w:cs="Arial"/>
-                <w:i w:val="false"/>
-                <w:b w:val="false"/>
-                <w:u w:val="none"/>
-                <w:strike w:val="false"/>
-                <w:sz w:val="18"/>
-                <w:szCs w:val="18"/>
-                <w:color w:val="000000"/>
-              </w:rPr>
-            </w:pPr>
-            <w:r>
-              <w:rPr>
-                <w:rFonts w:ascii="Arial" w:hAnsi="Arial" w:eastAsia="Arial" w:cs="Arial"/>
-                <w:i w:val="false"/>
-                <w:b w:val="false"/>
-                <w:u w:val="none"/>
-                <w:strike w:val="false"/>
-                <w:sz w:val="18"/>
-                <w:szCs w:val="18"/>
-                <w:color w:val="000000"/>
-              </w:rPr>
-              <w:t xml:space="preserve">100.0%</w:t>
-            </w:r>
-          </w:p>
-        </w:tc>
-      </w:tr>
-      <w:tr>
-        <w:trPr>
-          <w:cantSplit/>
-          <w:trHeight w:val="480" w:hRule="auto"/>
-        </w:trPr>
-        <w:tc>
-          <w:tcPr>
-            <w:gridSpan w:val="5"/>
-            <w:tcBorders>
-              <w:bottom w:val="none" w:sz="0" w:space="0" w:color="000000"/>
-              <w:top w:val="none" w:sz="0" w:space="0" w:color="000000"/>
-              <w:left w:val="none" w:sz="0" w:space="0" w:color="000000"/>
-              <w:right w:val="none" w:sz="0" w:space="0" w:color="000000"/>
-            </w:tcBorders>
-            <w:shd w:val="clear" w:color="auto" w:fill="FFFFFF"/>
-            <w:tcMar>
-              <w:top w:w="0" w:type="dxa"/>
-              <w:bottom w:w="0" w:type="dxa"/>
-              <w:left w:w="0" w:type="dxa"/>
-              <w:right w:w="0" w:type="dxa"/>
-            </w:tcMar>
-            <w:vAlign w:val="top"/>
-          </w:tcPr>
-          <w:p>
-            <w:pPr>
-              <w:pStyle w:val="Normal"/>
-              <w:jc w:val="left"/>
-              <w:pBdr>
-                <w:bottom w:val="none" w:sz="0" w:space="0" w:color="000000"/>
-                <w:top w:val="none" w:sz="0" w:space="0" w:color="000000"/>
-                <w:left w:val="none" w:sz="0" w:space="0" w:color="000000"/>
-                <w:right w:val="none" w:sz="0" w:space="0" w:color="000000"/>
-              </w:pBdr>
-              <w:spacing w:after="60" w:before="60" w:line="240"/>
-              <w:ind w:left="20" w:right="20" w:firstLine="0" w:firstLineChars="0"/>
-              <w:rPr>
-                <w:rFonts w:ascii="Arial" w:hAnsi="Arial" w:eastAsia="Arial" w:cs="Arial"/>
-                <w:i w:val="false"/>
-                <w:b w:val="true"/>
-                <w:u w:val="none"/>
-                <w:strike w:val="false"/>
-                <w:sz w:val="18"/>
-                <w:szCs w:val="18"/>
-                <w:color w:val="000000"/>
-              </w:rPr>
-            </w:pPr>
-            <w:r>
-              <w:rPr>
-                <w:rFonts w:ascii="Arial" w:hAnsi="Arial" w:eastAsia="Arial" w:cs="Arial"/>
-                <w:i w:val="false"/>
-                <w:b w:val="true"/>
-                <w:u w:val="none"/>
-                <w:strike w:val="false"/>
-                <w:sz w:val="18"/>
-                <w:szCs w:val="18"/>
-                <w:color w:val="000000"/>
-              </w:rPr>
-              <w:t xml:space="preserve">Paired difference, ARBITER − Unassisted</w:t>
+              <w:t xml:space="preserve">42/154 (27.3%; 20.4–34.3)</w:t>
             </w:r>
           </w:p>
         </w:tc>
@@ -2238,7 +1464,7 @@
                 <w:szCs w:val="18"/>
                 <w:color w:val="000000"/>
               </w:rPr>
-              <w:t xml:space="preserve">Published: D1⁠–⁠D5</w:t>
+              <w:t xml:space="preserve">ARBITER</w:t>
             </w:r>
           </w:p>
         </w:tc>
@@ -2293,7 +1519,7 @@
                 <w:szCs w:val="18"/>
                 <w:color w:val="000000"/>
               </w:rPr>
-              <w:t xml:space="preserve">0.06 (−0.03 to 0.14)</w:t>
+              <w:t xml:space="preserve">0.67 (0.56–0.76)</w:t>
             </w:r>
           </w:p>
         </w:tc>
@@ -2348,117 +1574,7 @@
                 <w:szCs w:val="18"/>
                 <w:color w:val="000000"/>
               </w:rPr>
-              <w:t xml:space="preserve">−1.8 (−5.1 to 1.6)</w:t>
-            </w:r>
-          </w:p>
-        </w:tc>
-        <w:tc>
-          <w:tcPr>
-            <w:tcBorders>
-              <w:bottom w:val="none" w:sz="0" w:space="0" w:color="000000"/>
-              <w:top w:val="none" w:sz="0" w:space="0" w:color="000000"/>
-              <w:left w:val="none" w:sz="0" w:space="0" w:color="000000"/>
-              <w:right w:val="none" w:sz="0" w:space="0" w:color="000000"/>
-            </w:tcBorders>
-            <w:shd w:val="clear" w:color="auto" w:fill="FFFFFF"/>
-            <w:tcMar>
-              <w:top w:w="0" w:type="dxa"/>
-              <w:bottom w:w="0" w:type="dxa"/>
-              <w:left w:w="0" w:type="dxa"/>
-              <w:right w:w="0" w:type="dxa"/>
-            </w:tcMar>
-            <w:vAlign w:val="top"/>
-          </w:tcPr>
-          <w:p>
-            <w:pPr>
-              <w:pStyle w:val="Normal"/>
-              <w:jc w:val="left"/>
-              <w:pBdr>
-                <w:bottom w:val="none" w:sz="0" w:space="0" w:color="000000"/>
-                <w:top w:val="none" w:sz="0" w:space="0" w:color="000000"/>
-                <w:left w:val="none" w:sz="0" w:space="0" w:color="000000"/>
-                <w:right w:val="none" w:sz="0" w:space="0" w:color="000000"/>
-              </w:pBdr>
-              <w:spacing w:after="60" w:before="60" w:line="240"/>
-              <w:ind w:left="20" w:right="20" w:firstLine="0" w:firstLineChars="0"/>
-              <w:rPr>
-                <w:rFonts w:ascii="Arial" w:hAnsi="Arial" w:eastAsia="Arial" w:cs="Arial"/>
-                <w:i w:val="false"/>
-                <w:b w:val="false"/>
-                <w:u w:val="none"/>
-                <w:strike w:val="false"/>
-                <w:sz w:val="18"/>
-                <w:szCs w:val="18"/>
-                <w:color w:val="000000"/>
-              </w:rPr>
-            </w:pPr>
-            <w:r>
-              <w:rPr>
-                <w:rFonts w:ascii="Arial" w:hAnsi="Arial" w:eastAsia="Arial" w:cs="Arial"/>
-                <w:i w:val="false"/>
-                <w:b w:val="false"/>
-                <w:u w:val="none"/>
-                <w:strike w:val="false"/>
-                <w:sz w:val="18"/>
-                <w:szCs w:val="18"/>
-                <w:color w:val="000000"/>
-              </w:rPr>
-              <w:t xml:space="preserve">15.7 (6.8–24.4)</w:t>
-            </w:r>
-          </w:p>
-        </w:tc>
-        <w:tc>
-          <w:tcPr>
-            <w:tcBorders>
-              <w:bottom w:val="none" w:sz="0" w:space="0" w:color="000000"/>
-              <w:top w:val="none" w:sz="0" w:space="0" w:color="000000"/>
-              <w:left w:val="none" w:sz="0" w:space="0" w:color="000000"/>
-              <w:right w:val="none" w:sz="0" w:space="0" w:color="000000"/>
-            </w:tcBorders>
-            <w:shd w:val="clear" w:color="auto" w:fill="FFFFFF"/>
-            <w:tcMar>
-              <w:top w:w="0" w:type="dxa"/>
-              <w:bottom w:w="0" w:type="dxa"/>
-              <w:left w:w="0" w:type="dxa"/>
-              <w:right w:w="0" w:type="dxa"/>
-            </w:tcMar>
-            <w:vAlign w:val="top"/>
-          </w:tcPr>
-          <w:p>
-            <w:pPr>
-              <w:pStyle w:val="Normal"/>
-              <w:jc w:val="left"/>
-              <w:pBdr>
-                <w:bottom w:val="none" w:sz="0" w:space="0" w:color="000000"/>
-                <w:top w:val="none" w:sz="0" w:space="0" w:color="000000"/>
-                <w:left w:val="none" w:sz="0" w:space="0" w:color="000000"/>
-                <w:right w:val="none" w:sz="0" w:space="0" w:color="000000"/>
-              </w:pBdr>
-              <w:spacing w:after="60" w:before="60" w:line="240"/>
-              <w:ind w:left="20" w:right="20" w:firstLine="0" w:firstLineChars="0"/>
-              <w:rPr>
-                <w:rFonts w:ascii="Arial" w:hAnsi="Arial" w:eastAsia="Arial" w:cs="Arial"/>
-                <w:i w:val="false"/>
-                <w:b w:val="false"/>
-                <w:u w:val="none"/>
-                <w:strike w:val="false"/>
-                <w:sz w:val="18"/>
-                <w:szCs w:val="18"/>
-                <w:color w:val="000000"/>
-              </w:rPr>
-            </w:pPr>
-            <w:r>
-              <w:rPr>
-                <w:rFonts w:ascii="Arial" w:hAnsi="Arial" w:eastAsia="Arial" w:cs="Arial"/>
-                <w:i w:val="false"/>
-                <w:b w:val="false"/>
-                <w:u w:val="none"/>
-                <w:strike w:val="false"/>
-                <w:sz w:val="18"/>
-                <w:szCs w:val="18"/>
-                <w:color w:val="000000"/>
-              </w:rPr>
-              <w:t xml:space="preserve">−4.4 (−7.6 to −1.2)</w:t>
+              <w:t xml:space="preserve">120/154 (77.9%; 71.7–84.0)</w:t>
             </w:r>
           </w:p>
         </w:tc>
@@ -2520,7 +1636,7 @@
                 <w:szCs w:val="18"/>
                 <w:color w:val="000000"/>
               </w:rPr>
-              <w:t xml:space="preserve">Published: Overall</w:t>
+              <w:t xml:space="preserve">Unassisted</w:t>
             </w:r>
           </w:p>
         </w:tc>
@@ -2576,7 +1692,7 @@
                 <w:szCs w:val="18"/>
                 <w:color w:val="000000"/>
               </w:rPr>
-              <w:t xml:space="preserve">0.02 (−0.11 to 0.16)</w:t>
+              <w:t xml:space="preserve">0.31 (0.19–0.42)</w:t>
             </w:r>
           </w:p>
         </w:tc>
@@ -2632,119 +1748,7 @@
                 <w:szCs w:val="18"/>
                 <w:color w:val="000000"/>
               </w:rPr>
-              <w:t xml:space="preserve">−1.2 (−11.1 to 8.6)</w:t>
-            </w:r>
-          </w:p>
-        </w:tc>
-        <w:tc>
-          <w:tcPr>
-            <w:tcBorders>
-              <w:bottom w:val="single" w:sz="8" w:space="0" w:color="000000"/>
-              <w:top w:val="none" w:sz="0" w:space="0" w:color="000000"/>
-              <w:left w:val="none" w:sz="0" w:space="0" w:color="000000"/>
-              <w:right w:val="none" w:sz="0" w:space="0" w:color="000000"/>
-            </w:tcBorders>
-            <w:shd w:val="clear" w:color="auto" w:fill="FFFFFF"/>
-            <w:tcMar>
-              <w:top w:w="0" w:type="dxa"/>
-              <w:bottom w:w="0" w:type="dxa"/>
-              <w:left w:w="0" w:type="dxa"/>
-              <w:right w:w="0" w:type="dxa"/>
-            </w:tcMar>
-            <w:vAlign w:val="top"/>
-          </w:tcPr>
-          <w:p>
-            <w:pPr>
-              <w:pStyle w:val="Normal"/>
-              <w:jc w:val="left"/>
-              <w:keepNext/>
-              <w:pBdr>
-                <w:bottom w:val="none" w:sz="0" w:space="0" w:color="000000"/>
-                <w:top w:val="none" w:sz="0" w:space="0" w:color="000000"/>
-                <w:left w:val="none" w:sz="0" w:space="0" w:color="000000"/>
-                <w:right w:val="none" w:sz="0" w:space="0" w:color="000000"/>
-              </w:pBdr>
-              <w:spacing w:after="60" w:before="60" w:line="240"/>
-              <w:ind w:left="20" w:right="20" w:firstLine="0" w:firstLineChars="0"/>
-              <w:rPr>
-                <w:rFonts w:ascii="Arial" w:hAnsi="Arial" w:eastAsia="Arial" w:cs="Arial"/>
-                <w:i w:val="false"/>
-                <w:b w:val="false"/>
-                <w:u w:val="none"/>
-                <w:strike w:val="false"/>
-                <w:sz w:val="18"/>
-                <w:szCs w:val="18"/>
-                <w:color w:val="000000"/>
-              </w:rPr>
-            </w:pPr>
-            <w:r>
-              <w:rPr>
-                <w:rFonts w:ascii="Arial" w:hAnsi="Arial" w:eastAsia="Arial" w:cs="Arial"/>
-                <w:i w:val="false"/>
-                <w:b w:val="false"/>
-                <w:u w:val="none"/>
-                <w:strike w:val="false"/>
-                <w:sz w:val="18"/>
-                <w:szCs w:val="18"/>
-                <w:color w:val="000000"/>
-              </w:rPr>
-              <w:t xml:space="preserve">28.2 (16.1–40.5)</w:t>
-            </w:r>
-          </w:p>
-        </w:tc>
-        <w:tc>
-          <w:tcPr>
-            <w:tcBorders>
-              <w:bottom w:val="single" w:sz="8" w:space="0" w:color="000000"/>
-              <w:top w:val="none" w:sz="0" w:space="0" w:color="000000"/>
-              <w:left w:val="none" w:sz="0" w:space="0" w:color="000000"/>
-              <w:right w:val="none" w:sz="0" w:space="0" w:color="000000"/>
-            </w:tcBorders>
-            <w:shd w:val="clear" w:color="auto" w:fill="FFFFFF"/>
-            <w:tcMar>
-              <w:top w:w="0" w:type="dxa"/>
-              <w:bottom w:w="0" w:type="dxa"/>
-              <w:left w:w="0" w:type="dxa"/>
-              <w:right w:w="0" w:type="dxa"/>
-            </w:tcMar>
-            <w:vAlign w:val="top"/>
-          </w:tcPr>
-          <w:p>
-            <w:pPr>
-              <w:pStyle w:val="Normal"/>
-              <w:jc w:val="left"/>
-              <w:keepNext/>
-              <w:pBdr>
-                <w:bottom w:val="none" w:sz="0" w:space="0" w:color="000000"/>
-                <w:top w:val="none" w:sz="0" w:space="0" w:color="000000"/>
-                <w:left w:val="none" w:sz="0" w:space="0" w:color="000000"/>
-                <w:right w:val="none" w:sz="0" w:space="0" w:color="000000"/>
-              </w:pBdr>
-              <w:spacing w:after="60" w:before="60" w:line="240"/>
-              <w:ind w:left="20" w:right="20" w:firstLine="0" w:firstLineChars="0"/>
-              <w:rPr>
-                <w:rFonts w:ascii="Arial" w:hAnsi="Arial" w:eastAsia="Arial" w:cs="Arial"/>
-                <w:i w:val="false"/>
-                <w:b w:val="false"/>
-                <w:u w:val="none"/>
-                <w:strike w:val="false"/>
-                <w:sz w:val="18"/>
-                <w:szCs w:val="18"/>
-                <w:color w:val="000000"/>
-              </w:rPr>
-            </w:pPr>
-            <w:r>
-              <w:rPr>
-                <w:rFonts w:ascii="Arial" w:hAnsi="Arial" w:eastAsia="Arial" w:cs="Arial"/>
-                <w:i w:val="false"/>
-                <w:b w:val="false"/>
-                <w:u w:val="none"/>
-                <w:strike w:val="false"/>
-                <w:sz w:val="18"/>
-                <w:szCs w:val="18"/>
-                <w:color w:val="000000"/>
-              </w:rPr>
-              <w:t xml:space="preserve">−21.4 (−32.7 to −9.8)</w:t>
+              <w:t xml:space="preserve">76/154 (49.4%; 42.2–56.5)</w:t>
             </w:r>
           </w:p>
         </w:tc>
@@ -2756,7 +1760,7 @@
         </w:trPr>
         <w:tc>
           <w:tcPr>
-            <w:gridSpan w:val="5"/>
+            <w:gridSpan w:val="3"/>
             <w:tcBorders>
               <w:bottom w:val="none" w:sz="0" w:space="0" w:color="FFFFFF"/>
               <w:top w:val="single" w:sz="8" w:space="0" w:color="000000"/>
@@ -2806,7 +1810,7 @@
                 <w:szCs w:val="18"/>
                 <w:color w:val="000000"/>
               </w:rPr>
-              <w:t xml:space="preserve">Published means published review label. Values are coefficients or percentages (95% CI); denominators are in block labels. ¹ Sensitivity for Some concerns or High; specificity is the share of published Low ratings also rated Low. All-Low rule has no variance; only accuracy and specificity are reported. Paired differences are coefficients or percentage points; — indicates undefined or not applicable. AC2 and composite-reference results: eTables 9 and 10. Full paired differences: eTables 11–12. Overall judgements were not adjudicated. Published labels were frequently less severe than the adjudicators’ agreed choice (Figure 4). CI, confidence interval; 10,000 percentile bootstrap replicates, trials resampled within meta-analysis; seed 20261018.</w:t>
+              <w:t xml:space="preserve">All comparisons use the 154 domain ratings reviewed because at least one Sonnet arm differed from the published label. These comparisons cannot estimate agreement or published-label accuracy in the full benchmark. Independent ratings preceded blinded label presentation. Adjudicators then chose among the three offered labels. Linearly weighted Cohen’s κ; AC2 is in eTable 17; raw agreement is n/N (x.x%; 95% CI a–b). CI, confidence interval; 10,000 percentile bootstrap replicates, trials resampled within meta-analysis; seed 20261018.</w:t>
             </w:r>
           </w:p>
         </w:tc>

</xml_diff>

<commit_message>
Round 14b: landscape-driven analyses, Table 4 lineage and wording rules
WP-A round 2 and WP-T2 (GPT-6.1-Sol), reviewed by orchestrator. Adds
preferred-share wording, composite split, independent-rating paired
differences, question 5.1 description, label-target matching, cost labels,
TRIPOD-LLM map and RobotReviewer row. See analysis/round14-report.md.

Co-Authored-By: Claude Opus 5.5 <noreply@anthropic.com>
</commit_message>
<xml_diff>
--- a/analysis/output/manuscript/Table2.docx
+++ b/analysis/output/manuscript/Table2.docx
@@ -1582,6 +1582,410 @@
       <w:tr>
         <w:trPr>
           <w:cantSplit/>
+          <w:trHeight w:val="480" w:hRule="auto"/>
+        </w:trPr>
+        <w:tc>
+          <w:tcPr>
+            <w:tcBorders>
+              <w:bottom w:val="none" w:sz="0" w:space="0" w:color="000000"/>
+              <w:top w:val="none" w:sz="0" w:space="0" w:color="000000"/>
+              <w:left w:val="none" w:sz="0" w:space="0" w:color="000000"/>
+              <w:right w:val="none" w:sz="0" w:space="0" w:color="000000"/>
+            </w:tcBorders>
+            <w:shd w:val="clear" w:color="auto" w:fill="FFFFFF"/>
+            <w:tcMar>
+              <w:top w:w="0" w:type="dxa"/>
+              <w:bottom w:w="0" w:type="dxa"/>
+              <w:left w:w="0" w:type="dxa"/>
+              <w:right w:w="0" w:type="dxa"/>
+            </w:tcMar>
+            <w:vAlign w:val="top"/>
+          </w:tcPr>
+          <w:p>
+            <w:pPr>
+              <w:pStyle w:val="Normal"/>
+              <w:jc w:val="left"/>
+              <w:pBdr>
+                <w:bottom w:val="none" w:sz="0" w:space="0" w:color="000000"/>
+                <w:top w:val="none" w:sz="0" w:space="0" w:color="000000"/>
+                <w:left w:val="none" w:sz="0" w:space="0" w:color="000000"/>
+                <w:right w:val="none" w:sz="0" w:space="0" w:color="000000"/>
+              </w:pBdr>
+              <w:spacing w:after="60" w:before="60" w:line="240"/>
+              <w:ind w:left="20" w:right="20" w:firstLine="0" w:firstLineChars="0"/>
+              <w:rPr>
+                <w:rFonts w:ascii="Arial" w:hAnsi="Arial" w:eastAsia="Arial" w:cs="Arial"/>
+                <w:i w:val="false"/>
+                <w:b w:val="false"/>
+                <w:u w:val="none"/>
+                <w:strike w:val="false"/>
+                <w:sz w:val="18"/>
+                <w:szCs w:val="18"/>
+                <w:color w:val="000000"/>
+              </w:rPr>
+            </w:pPr>
+            <w:r>
+              <w:rPr>
+                <w:rFonts w:ascii="Arial" w:hAnsi="Arial" w:eastAsia="Arial" w:cs="Arial"/>
+                <w:i w:val="false"/>
+                <w:b w:val="false"/>
+                <w:u w:val="none"/>
+                <w:strike w:val="false"/>
+                <w:sz w:val="18"/>
+                <w:szCs w:val="18"/>
+                <w:color w:val="000000"/>
+              </w:rPr>
+              <w:t xml:space="preserve">Unassisted</w:t>
+            </w:r>
+          </w:p>
+        </w:tc>
+        <w:tc>
+          <w:tcPr>
+            <w:tcBorders>
+              <w:bottom w:val="none" w:sz="0" w:space="0" w:color="000000"/>
+              <w:top w:val="none" w:sz="0" w:space="0" w:color="000000"/>
+              <w:left w:val="none" w:sz="0" w:space="0" w:color="000000"/>
+              <w:right w:val="none" w:sz="0" w:space="0" w:color="000000"/>
+            </w:tcBorders>
+            <w:shd w:val="clear" w:color="auto" w:fill="FFFFFF"/>
+            <w:tcMar>
+              <w:top w:w="0" w:type="dxa"/>
+              <w:bottom w:w="0" w:type="dxa"/>
+              <w:left w:w="0" w:type="dxa"/>
+              <w:right w:w="0" w:type="dxa"/>
+            </w:tcMar>
+            <w:vAlign w:val="top"/>
+          </w:tcPr>
+          <w:p>
+            <w:pPr>
+              <w:pStyle w:val="Normal"/>
+              <w:jc w:val="left"/>
+              <w:pBdr>
+                <w:bottom w:val="none" w:sz="0" w:space="0" w:color="000000"/>
+                <w:top w:val="none" w:sz="0" w:space="0" w:color="000000"/>
+                <w:left w:val="none" w:sz="0" w:space="0" w:color="000000"/>
+                <w:right w:val="none" w:sz="0" w:space="0" w:color="000000"/>
+              </w:pBdr>
+              <w:spacing w:after="60" w:before="60" w:line="240"/>
+              <w:ind w:left="20" w:right="20" w:firstLine="0" w:firstLineChars="0"/>
+              <w:rPr>
+                <w:rFonts w:ascii="Arial" w:hAnsi="Arial" w:eastAsia="Arial" w:cs="Arial"/>
+                <w:i w:val="false"/>
+                <w:b w:val="false"/>
+                <w:u w:val="none"/>
+                <w:strike w:val="false"/>
+                <w:sz w:val="18"/>
+                <w:szCs w:val="18"/>
+                <w:color w:val="000000"/>
+              </w:rPr>
+            </w:pPr>
+            <w:r>
+              <w:rPr>
+                <w:rFonts w:ascii="Arial" w:hAnsi="Arial" w:eastAsia="Arial" w:cs="Arial"/>
+                <w:i w:val="false"/>
+                <w:b w:val="false"/>
+                <w:u w:val="none"/>
+                <w:strike w:val="false"/>
+                <w:sz w:val="18"/>
+                <w:szCs w:val="18"/>
+                <w:color w:val="000000"/>
+              </w:rPr>
+              <w:t xml:space="preserve">0.31 (0.19–0.42)</w:t>
+            </w:r>
+          </w:p>
+        </w:tc>
+        <w:tc>
+          <w:tcPr>
+            <w:tcBorders>
+              <w:bottom w:val="none" w:sz="0" w:space="0" w:color="000000"/>
+              <w:top w:val="none" w:sz="0" w:space="0" w:color="000000"/>
+              <w:left w:val="none" w:sz="0" w:space="0" w:color="000000"/>
+              <w:right w:val="none" w:sz="0" w:space="0" w:color="000000"/>
+            </w:tcBorders>
+            <w:shd w:val="clear" w:color="auto" w:fill="FFFFFF"/>
+            <w:tcMar>
+              <w:top w:w="0" w:type="dxa"/>
+              <w:bottom w:w="0" w:type="dxa"/>
+              <w:left w:w="0" w:type="dxa"/>
+              <w:right w:w="0" w:type="dxa"/>
+            </w:tcMar>
+            <w:vAlign w:val="top"/>
+          </w:tcPr>
+          <w:p>
+            <w:pPr>
+              <w:pStyle w:val="Normal"/>
+              <w:jc w:val="left"/>
+              <w:pBdr>
+                <w:bottom w:val="none" w:sz="0" w:space="0" w:color="000000"/>
+                <w:top w:val="none" w:sz="0" w:space="0" w:color="000000"/>
+                <w:left w:val="none" w:sz="0" w:space="0" w:color="000000"/>
+                <w:right w:val="none" w:sz="0" w:space="0" w:color="000000"/>
+              </w:pBdr>
+              <w:spacing w:after="60" w:before="60" w:line="240"/>
+              <w:ind w:left="20" w:right="20" w:firstLine="0" w:firstLineChars="0"/>
+              <w:rPr>
+                <w:rFonts w:ascii="Arial" w:hAnsi="Arial" w:eastAsia="Arial" w:cs="Arial"/>
+                <w:i w:val="false"/>
+                <w:b w:val="false"/>
+                <w:u w:val="none"/>
+                <w:strike w:val="false"/>
+                <w:sz w:val="18"/>
+                <w:szCs w:val="18"/>
+                <w:color w:val="000000"/>
+              </w:rPr>
+            </w:pPr>
+            <w:r>
+              <w:rPr>
+                <w:rFonts w:ascii="Arial" w:hAnsi="Arial" w:eastAsia="Arial" w:cs="Arial"/>
+                <w:i w:val="false"/>
+                <w:b w:val="false"/>
+                <w:u w:val="none"/>
+                <w:strike w:val="false"/>
+                <w:sz w:val="18"/>
+                <w:szCs w:val="18"/>
+                <w:color w:val="000000"/>
+              </w:rPr>
+              <w:t xml:space="preserve">76/154 (49.4%; 42.2–56.5)</w:t>
+            </w:r>
+          </w:p>
+        </w:tc>
+      </w:tr>
+      <w:tr>
+        <w:trPr>
+          <w:cantSplit/>
+          <w:trHeight w:val="480" w:hRule="auto"/>
+        </w:trPr>
+        <w:tc>
+          <w:tcPr>
+            <w:gridSpan w:val="3"/>
+            <w:tcBorders>
+              <w:bottom w:val="none" w:sz="0" w:space="0" w:color="000000"/>
+              <w:top w:val="none" w:sz="0" w:space="0" w:color="000000"/>
+              <w:left w:val="none" w:sz="0" w:space="0" w:color="000000"/>
+              <w:right w:val="none" w:sz="0" w:space="0" w:color="000000"/>
+            </w:tcBorders>
+            <w:shd w:val="clear" w:color="auto" w:fill="FFFFFF"/>
+            <w:tcMar>
+              <w:top w:w="0" w:type="dxa"/>
+              <w:bottom w:w="0" w:type="dxa"/>
+              <w:left w:w="0" w:type="dxa"/>
+              <w:right w:w="0" w:type="dxa"/>
+            </w:tcMar>
+            <w:vAlign w:val="top"/>
+          </w:tcPr>
+          <w:p>
+            <w:pPr>
+              <w:pStyle w:val="Normal"/>
+              <w:jc w:val="left"/>
+              <w:pBdr>
+                <w:bottom w:val="none" w:sz="0" w:space="0" w:color="000000"/>
+                <w:top w:val="none" w:sz="0" w:space="0" w:color="000000"/>
+                <w:left w:val="none" w:sz="0" w:space="0" w:color="000000"/>
+                <w:right w:val="none" w:sz="0" w:space="0" w:color="000000"/>
+              </w:pBdr>
+              <w:spacing w:after="60" w:before="60" w:line="240"/>
+              <w:ind w:left="20" w:right="20" w:firstLine="0" w:firstLineChars="0"/>
+              <w:rPr>
+                <w:rFonts w:ascii="Arial" w:hAnsi="Arial" w:eastAsia="Arial" w:cs="Arial"/>
+                <w:i w:val="false"/>
+                <w:b w:val="true"/>
+                <w:u w:val="none"/>
+                <w:strike w:val="false"/>
+                <w:sz w:val="18"/>
+                <w:szCs w:val="18"/>
+                <w:color w:val="000000"/>
+              </w:rPr>
+            </w:pPr>
+            <w:r>
+              <w:rPr>
+                <w:rFonts w:ascii="Arial" w:hAnsi="Arial" w:eastAsia="Arial" w:cs="Arial"/>
+                <w:i w:val="false"/>
+                <w:b w:val="true"/>
+                <w:u w:val="none"/>
+                <w:strike w:val="false"/>
+                <w:sz w:val="18"/>
+                <w:szCs w:val="18"/>
+                <w:color w:val="000000"/>
+              </w:rPr>
+              <w:t xml:space="preserve">Post hoc: paired agreement difference (percentage points)</w:t>
+            </w:r>
+          </w:p>
+        </w:tc>
+      </w:tr>
+      <w:tr>
+        <w:trPr>
+          <w:cantSplit/>
+          <w:trHeight w:val="480" w:hRule="auto"/>
+        </w:trPr>
+        <w:tc>
+          <w:tcPr>
+            <w:tcBorders>
+              <w:bottom w:val="none" w:sz="0" w:space="0" w:color="000000"/>
+              <w:top w:val="none" w:sz="0" w:space="0" w:color="000000"/>
+              <w:left w:val="none" w:sz="0" w:space="0" w:color="000000"/>
+              <w:right w:val="none" w:sz="0" w:space="0" w:color="000000"/>
+            </w:tcBorders>
+            <w:shd w:val="clear" w:color="auto" w:fill="FFFFFF"/>
+            <w:tcMar>
+              <w:top w:w="0" w:type="dxa"/>
+              <w:bottom w:w="0" w:type="dxa"/>
+              <w:left w:w="0" w:type="dxa"/>
+              <w:right w:w="0" w:type="dxa"/>
+            </w:tcMar>
+            <w:vAlign w:val="top"/>
+          </w:tcPr>
+          <w:p>
+            <w:pPr>
+              <w:pStyle w:val="Normal"/>
+              <w:jc w:val="left"/>
+              <w:pBdr>
+                <w:bottom w:val="none" w:sz="0" w:space="0" w:color="000000"/>
+                <w:top w:val="none" w:sz="0" w:space="0" w:color="000000"/>
+                <w:left w:val="none" w:sz="0" w:space="0" w:color="000000"/>
+                <w:right w:val="none" w:sz="0" w:space="0" w:color="000000"/>
+              </w:pBdr>
+              <w:spacing w:after="60" w:before="60" w:line="240"/>
+              <w:ind w:left="20" w:right="20" w:firstLine="0" w:firstLineChars="0"/>
+              <w:rPr>
+                <w:rFonts w:ascii="Arial" w:hAnsi="Arial" w:eastAsia="Arial" w:cs="Arial"/>
+                <w:i w:val="false"/>
+                <w:b w:val="false"/>
+                <w:u w:val="none"/>
+                <w:strike w:val="false"/>
+                <w:sz w:val="18"/>
+                <w:szCs w:val="18"/>
+                <w:color w:val="000000"/>
+              </w:rPr>
+            </w:pPr>
+            <w:r>
+              <w:rPr>
+                <w:rFonts w:ascii="Arial" w:hAnsi="Arial" w:eastAsia="Arial" w:cs="Arial"/>
+                <w:i w:val="false"/>
+                <w:b w:val="false"/>
+                <w:u w:val="none"/>
+                <w:strike w:val="false"/>
+                <w:sz w:val="18"/>
+                <w:szCs w:val="18"/>
+                <w:color w:val="000000"/>
+              </w:rPr>
+              <w:t xml:space="preserve">Adjudicator 1</w:t>
+            </w:r>
+          </w:p>
+        </w:tc>
+        <w:tc>
+          <w:tcPr>
+            <w:tcBorders>
+              <w:bottom w:val="none" w:sz="0" w:space="0" w:color="000000"/>
+              <w:top w:val="none" w:sz="0" w:space="0" w:color="000000"/>
+              <w:left w:val="none" w:sz="0" w:space="0" w:color="000000"/>
+              <w:right w:val="none" w:sz="0" w:space="0" w:color="000000"/>
+            </w:tcBorders>
+            <w:shd w:val="clear" w:color="auto" w:fill="FFFFFF"/>
+            <w:tcMar>
+              <w:top w:w="0" w:type="dxa"/>
+              <w:bottom w:w="0" w:type="dxa"/>
+              <w:left w:w="0" w:type="dxa"/>
+              <w:right w:w="0" w:type="dxa"/>
+            </w:tcMar>
+            <w:vAlign w:val="top"/>
+          </w:tcPr>
+          <w:p>
+            <w:pPr>
+              <w:pStyle w:val="Normal"/>
+              <w:jc w:val="left"/>
+              <w:pBdr>
+                <w:bottom w:val="none" w:sz="0" w:space="0" w:color="000000"/>
+                <w:top w:val="none" w:sz="0" w:space="0" w:color="000000"/>
+                <w:left w:val="none" w:sz="0" w:space="0" w:color="000000"/>
+                <w:right w:val="none" w:sz="0" w:space="0" w:color="000000"/>
+              </w:pBdr>
+              <w:spacing w:after="60" w:before="60" w:line="240"/>
+              <w:ind w:left="20" w:right="20" w:firstLine="0" w:firstLineChars="0"/>
+              <w:rPr>
+                <w:rFonts w:ascii="Arial" w:hAnsi="Arial" w:eastAsia="Arial" w:cs="Arial"/>
+                <w:i w:val="false"/>
+                <w:b w:val="false"/>
+                <w:u w:val="none"/>
+                <w:strike w:val="false"/>
+                <w:sz w:val="18"/>
+                <w:szCs w:val="18"/>
+                <w:color w:val="000000"/>
+              </w:rPr>
+            </w:pPr>
+            <w:r>
+              <w:rPr>
+                <w:rFonts w:ascii="Arial" w:hAnsi="Arial" w:eastAsia="Arial" w:cs="Arial"/>
+                <w:i w:val="false"/>
+                <w:b w:val="false"/>
+                <w:u w:val="none"/>
+                <w:strike w:val="false"/>
+                <w:sz w:val="18"/>
+                <w:szCs w:val="18"/>
+                <w:color w:val="000000"/>
+              </w:rPr>
+              <w:t xml:space="preserve">—</w:t>
+            </w:r>
+          </w:p>
+        </w:tc>
+        <w:tc>
+          <w:tcPr>
+            <w:tcBorders>
+              <w:bottom w:val="none" w:sz="0" w:space="0" w:color="000000"/>
+              <w:top w:val="none" w:sz="0" w:space="0" w:color="000000"/>
+              <w:left w:val="none" w:sz="0" w:space="0" w:color="000000"/>
+              <w:right w:val="none" w:sz="0" w:space="0" w:color="000000"/>
+            </w:tcBorders>
+            <w:shd w:val="clear" w:color="auto" w:fill="FFFFFF"/>
+            <w:tcMar>
+              <w:top w:w="0" w:type="dxa"/>
+              <w:bottom w:w="0" w:type="dxa"/>
+              <w:left w:w="0" w:type="dxa"/>
+              <w:right w:w="0" w:type="dxa"/>
+            </w:tcMar>
+            <w:vAlign w:val="top"/>
+          </w:tcPr>
+          <w:p>
+            <w:pPr>
+              <w:pStyle w:val="Normal"/>
+              <w:jc w:val="left"/>
+              <w:pBdr>
+                <w:bottom w:val="none" w:sz="0" w:space="0" w:color="000000"/>
+                <w:top w:val="none" w:sz="0" w:space="0" w:color="000000"/>
+                <w:left w:val="none" w:sz="0" w:space="0" w:color="000000"/>
+                <w:right w:val="none" w:sz="0" w:space="0" w:color="000000"/>
+              </w:pBdr>
+              <w:spacing w:after="60" w:before="60" w:line="240"/>
+              <w:ind w:left="20" w:right="20" w:firstLine="0" w:firstLineChars="0"/>
+              <w:rPr>
+                <w:rFonts w:ascii="Arial" w:hAnsi="Arial" w:eastAsia="Arial" w:cs="Arial"/>
+                <w:i w:val="false"/>
+                <w:b w:val="false"/>
+                <w:u w:val="none"/>
+                <w:strike w:val="false"/>
+                <w:sz w:val="18"/>
+                <w:szCs w:val="18"/>
+                <w:color w:val="000000"/>
+              </w:rPr>
+            </w:pPr>
+            <w:r>
+              <w:rPr>
+                <w:rFonts w:ascii="Arial" w:hAnsi="Arial" w:eastAsia="Arial" w:cs="Arial"/>
+                <w:i w:val="false"/>
+                <w:b w:val="false"/>
+                <w:u w:val="none"/>
+                <w:strike w:val="false"/>
+                <w:sz w:val="18"/>
+                <w:szCs w:val="18"/>
+                <w:color w:val="000000"/>
+              </w:rPr>
+              <w:t xml:space="preserve">24.7 (16.2–32.9)</w:t>
+            </w:r>
+          </w:p>
+        </w:tc>
+      </w:tr>
+      <w:tr>
+        <w:trPr>
+          <w:cantSplit/>
           <w:trHeight w:val="490" w:hRule="auto"/>
         </w:trPr>
         <w:tc>
@@ -1636,7 +2040,7 @@
                 <w:szCs w:val="18"/>
                 <w:color w:val="000000"/>
               </w:rPr>
-              <w:t xml:space="preserve">Unassisted</w:t>
+              <w:t xml:space="preserve">Adjudicator 2</w:t>
             </w:r>
           </w:p>
         </w:tc>
@@ -1692,7 +2096,7 @@
                 <w:szCs w:val="18"/>
                 <w:color w:val="000000"/>
               </w:rPr>
-              <w:t xml:space="preserve">0.31 (0.19–0.42)</w:t>
+              <w:t xml:space="preserve">—</w:t>
             </w:r>
           </w:p>
         </w:tc>
@@ -1748,7 +2152,7 @@
                 <w:szCs w:val="18"/>
                 <w:color w:val="000000"/>
               </w:rPr>
-              <w:t xml:space="preserve">76/154 (49.4%; 42.2–56.5)</w:t>
+              <w:t xml:space="preserve">28.6 (19.8–37.4)</w:t>
             </w:r>
           </w:p>
         </w:tc>
@@ -1810,7 +2214,7 @@
                 <w:szCs w:val="18"/>
                 <w:color w:val="000000"/>
               </w:rPr>
-              <w:t xml:space="preserve">All comparisons use the 154 domain ratings reviewed because at least one Sonnet arm differed from the published label. These comparisons cannot estimate agreement or published-label accuracy in the full benchmark. Independent ratings preceded blinded label presentation. Adjudicators then chose among the three offered labels. Linearly weighted Cohen’s κ; AC2 is in eTable 17; raw agreement is n/N (x.x%; 95% CI a–b). CI, confidence interval; 10,000 percentile bootstrap replicates, trials resampled within meta-analysis; seed 20261018.</w:t>
+              <w:t xml:space="preserve">All comparisons use the 154 domain ratings reviewed because at least one arm differed from the published label. These comparisons cannot estimate agreement or published-label accuracy in the full benchmark. Adjudicators used no AI; each independent rating was made and frozen before the adjudicator saw any label. They then saw only three labels in an order randomised per cell, without rationales or quotations.  Linearly weighted Cohen’s κ; AC2 is in eTable 17; raw agreement is n/N (x.x%; 95% CI a–b). Post hoc paired differences are ARBITER minus Unassisted agreement with the same independent rating, in percentage points. CI, confidence interval; 10,000 percentile bootstrap replicates, trials resampled within meta-analysis; seed 20261018.</w:t>
             </w:r>
           </w:p>
         </w:tc>

</xml_diff>